<commit_message>
merge: apply learnflow-main snapshot (full overwrite union, 95 effective changes)
Import C:/Users/mac/Downloads/learnflow-main into E:/learnflow per user
decision '全部覆盖'. Union merge: 720 source files -> 625 identical
(no-op) + 81 overwritten (tracked) + 14 added (4 visible untracked,
10 __pycache__/*.pyc gitignored). 25,701 target-unique files preserved.

Recovery tag pre-merge-20260930 = b41a76a retained.

NOTE: 6 REGRESS files (split-plan md, verify_asset_numbers.py,
asset_numbers.json, research report/plan md, _sync_test_count_936.py)
revert the 09-29 digital-drift fix; verify_asset_numbers.py --doc-check
now exits 1 (DRIFT) by deliberate user choice.
</commit_message>
<xml_diff>
--- a/output/20260928-en-submissions/M1/stage3/M1_难度可公度性与最优错误率_EN_终稿.docx
+++ b/output/20260928-en-submissions/M1/stage3/M1_难度可公度性与最优错误率_EN_终稿.docx
@@ -15,7 +15,7 @@
           <w:color w:val="000000"/>
           <w:sz w:val="36"/>
         </w:rPr>
-        <w:t>Difficulty Commensurability and the Optimal Error Rate</w:t>
+        <w:t>Commensurability of Difficulty Scales: An Instability Proposition and Its Test on assist09</w:t>
       </w:r>
     </w:p>
     <w:p>
@@ -64,7 +64,127 @@
         <w:rPr>
           <w:sz w:val="22"/>
         </w:rPr>
-        <w:t>AI-Assisted Writing Disclosure. This manuscript was prepared with the assistance of a large language model (LLM) used strictly as a language-polishing and drafting aid. No LLM authored scientific content or made any analytical, statistical, or experimental decision; all results, claims, and numerical values were produced by the authors' own experiments, simulations, and scripts. The LLM was not used to generate data, analyses, or conclusions.</w:t>
+        <w:t xml:space="preserve">AI-Assisted Writing Disclosure.This manuscript was prepared with the assistance of large language models (LLMs) and AI coding agents.These tools were used, to varying extents, for: (i) generating and editing analysis scripts; (ii) executing and re-running experiments; (iii) drafting, translating and polishing manuscript text; (iv) drafting internal revision-tracking documents.The claim made in an earlier version of this disclosure — that the LLM "was used strictly as a language-polishing and drafting aid" and that no LLM participated in analytical, statistical or experimental work — </w:t>
+      </w:r>
+      <w:r>
+        <w:rPr>
+          <w:b/>
+          <w:sz w:val="22"/>
+        </w:rPr>
+        <w:t>has been withdrawn</w:t>
+      </w:r>
+      <w:r>
+        <w:rPr>
+          <w:sz w:val="22"/>
+        </w:rPr>
+        <w:t>, because it is not consistent with the traces visible in the accompanying repository (supervisor's review §2.3, 2026-09-29).</w:t>
+      </w:r>
+    </w:p>
+    <w:p>
+      <w:pPr>
+        <w:spacing w:after="44"/>
+        <w:ind w:firstLine="0"/>
+        <w:jc w:val="center"/>
+      </w:pPr>
+      <w:r>
+        <w:rPr>
+          <w:sz w:val="22"/>
+        </w:rPr>
+        <w:t xml:space="preserve">The per-task division of work between the author and these tools, and the scope of the author's own verification of each tool output, is recorded by the author in the role-and-tools table of the dissertation proposal (§10.1) and will be stated here in its final form before submission.The corresponding author has </w:t>
+      </w:r>
+      <w:r>
+        <w:rPr>
+          <w:b/>
+          <w:sz w:val="22"/>
+        </w:rPr>
+        <w:t>not</w:t>
+      </w:r>
+      <w:r>
+        <w:rPr>
+          <w:sz w:val="22"/>
+        </w:rPr>
+        <w:t xml:space="preserve"> yet reviewed and approved this disclosure; accordingly, and per review §10, the corresponding author's name is withheld from this manuscript until the final version is approved.All numerical results reported here were produced by the scripts in the accompanying repository and are reproducible from them.</w:t>
+      </w:r>
+    </w:p>
+    <w:p>
+      <w:pPr>
+        <w:ind w:firstLine="360"/>
+        <w:jc w:val="both"/>
+      </w:pPr>
+      <w:r>
+        <w:rPr>
+          <w:b/>
+        </w:rPr>
+        <w:t>Relation to the companion manuscript M4 (review §4.1 / §4.4, 2026-09-29).</w:t>
+      </w:r>
+      <w:r>
+        <w:t xml:space="preserve"> A companion manuscript M4 (</w:t>
+      </w:r>
+      <w:r>
+        <w:rPr>
+          <w:i/>
+        </w:rPr>
+        <w:t>Reliability-Structured Combined Difficulty Estimation</w:t>
+      </w:r>
+      <w:r>
+        <w:t xml:space="preserve">) shares its empirical basis with §7 of this paper (the same </w:t>
+      </w:r>
+      <w:r>
+        <w:rPr>
+          <w:rFonts w:ascii="Courier New" w:hAnsi="Courier New"/>
+          <w:sz w:val="22"/>
+        </w:rPr>
+        <w:t>difficulty_cache.npz</w:t>
+      </w:r>
+      <w:r>
+        <w:t xml:space="preserve">, the same DBE teacher labels, the same Junyi labels, the same B-block holdout, the same </w:t>
+      </w:r>
+      <w:r>
+        <w:rPr>
+          <w:rFonts w:ascii="Courier New" w:hAnsi="Courier New"/>
+          <w:sz w:val="22"/>
+        </w:rPr>
+        <w:t>λ_cf</w:t>
+      </w:r>
+      <w:r>
+        <w:t xml:space="preserve">, the same </w:t>
+      </w:r>
+      <w:r>
+        <w:rPr>
+          <w:rFonts w:ascii="Courier New" w:hAnsi="Courier New"/>
+          <w:sz w:val="22"/>
+        </w:rPr>
+        <w:t>srw7</w:t>
+      </w:r>
+      <w:r>
+        <w:t xml:space="preserve">). Per review §4.4, </w:t>
+      </w:r>
+      <w:r>
+        <w:rPr>
+          <w:b/>
+        </w:rPr>
+        <w:t>M4 is not submitted as an independent manuscript</w:t>
+      </w:r>
+      <w:r>
+        <w:t xml:space="preserve">; its disposition (merged into this paper as a section, or a pre-registered confirmatory experiment on a different dataset) is to be decided on </w:t>
+      </w:r>
+      <w:r>
+        <w:rPr>
+          <w:b/>
+        </w:rPr>
+        <w:t>2026-11-03</w:t>
+      </w:r>
+      <w:r>
+        <w:t xml:space="preserve">, with no new experiments added before that date. </w:t>
+      </w:r>
+      <w:r>
+        <w:rPr>
+          <w:b/>
+        </w:rPr>
+        <w:t>For any quantity bearing the same name in both, this paper is authoritative</w:t>
+      </w:r>
+      <w:r>
+        <w:t>; M4 may not set priority in the reverse direction.</w:t>
       </w:r>
     </w:p>
     <w:p>
@@ -184,13 +304,26 @@
           <w:b/>
           <w:sz w:val="21"/>
         </w:rPr>
+        <w:t>Qualification (review §3.2 ③): when the criterion quantity is success rate, the success-rate estimator's dominance at large samples is design-expected; fusion's role is rank stabilisation at small samples.</w:t>
+      </w:r>
+      <w:r>
+        <w:rPr>
+          <w:sz w:val="21"/>
+        </w:rPr>
+        <w:t xml:space="preserve"> </w:t>
+      </w:r>
+      <w:r>
+        <w:rPr>
+          <w:b/>
+          <w:sz w:val="21"/>
+        </w:rPr>
         <w:t>Third, the above gain reverses under a changed criterion.</w:t>
       </w:r>
       <w:r>
         <w:rPr>
           <w:sz w:val="21"/>
         </w:rPr>
-        <w:t xml:space="preserve"> The rank correlation between expert labels and real-performance difficulty is only 0.4326; once the criterion is switched to "real performance on unseen samples," equal-weight fusion is worse than success rate alone at every sample size on both Junyi and DBE (Junyi −0.0267 → −0.1222, DBE −0.1752 → −0.2113, fusion win rate 0.00).One located cause is a directional error in the fusion configuration (the upgrade rate was assigned a positive weight +0.154); after its removal and the introduction of sample-size-adaptive shrinkage λ*(k) = 1/(1+(k/27.4)^0.902) (R² = 0.9989; the deployed value uses the leave-one-k cross-validation fit 27.3 / 0.895, rounded from k₀ = 27.332), the small-sample bracket first overtakes (k = 10: +3.43 percentage points), but the gain falls below 0.22 pp for k ≥ 100.</w:t>
+        <w:t xml:space="preserve"> The rank correlation between expert labels and real-performance difficulty is only 0.4326; once the criterion is switched to "real performance on unseen samples," equal-weight fusion is worse than success rate alone at every sample size on both Junyi and DBE (Junyi −0.0267 → −0.1222, DBE −0.1752 → −0.2113, fusion win rate 0.00).</w:t>
       </w:r>
     </w:p>
     <w:p>
@@ -203,20 +336,7 @@
         <w:rPr>
           <w:sz w:val="21"/>
         </w:rPr>
-        <w:t xml:space="preserve">Further, we optimise the fusion estimator itself—sign-correcting each signal by its in-fit-block rank correlation (retaining the information of inversely signed signals rather than dropping the column) and split-half-reliability weighting per signal—yielding the </w:t>
-      </w:r>
-      <w:r>
-        <w:rPr>
-          <w:rFonts w:ascii="Courier New" w:hAnsi="Courier New"/>
-          <w:sz w:val="22"/>
-        </w:rPr>
-        <w:t>srw7</w:t>
-      </w:r>
-      <w:r>
-        <w:rPr>
-          <w:sz w:val="21"/>
-        </w:rPr>
-        <w:t xml:space="preserve"> estimator; under both record-level and student-level double holdout it is non-inferior to the "success-rate-only" baseline at every sample size and exceeds O8's fused6 at all brackets (record-level +3.823 / +2.025 / +0.930 / +0.391 / +0.138 pp; student-level +4.283 / +2.189 / +0.951 / +0.335 / +0.102 pp), eliminating fused6's harmfulness below baseline for k ≥ 25.Finally, we report the sliding-window error-rate distribution on assist09 (n = 286,150 windows; mean 0.3511).</w:t>
+        <w:t>One located cause is a directional error in the fusion configuration (the upgrade rate was assigned a positive weight +0.154); after its removal and the introduction of sample-size-adaptive shrinkage λ*(k) = 1/(1+(k/27.4)^0.902) (R² = 0.9989; the deployed value uses the leave-one-k cross-validation fit 27.3 / 0.895, rounded from k₀ = 27.332), the small-sample bracket first overtakes (k = 10: +3.43 percentage points), but the gain falls below 0.22 pp for k ≥ 100.</w:t>
       </w:r>
     </w:p>
     <w:p>
@@ -229,7 +349,20 @@
         <w:rPr>
           <w:sz w:val="21"/>
         </w:rPr>
-        <w:t>At window width W = 20 it has only 21 discrete support points (k/20); recomputed by integer error counts, the single-value mode is an error rate of 0.25 (success rate 75%, 30,899 windows), while the 80–85% success band occupies only 19.64% of windows.The earlier-reported "mode interval 0.15–0.20 (success 80–85%)" was a binning-boundary artifact (floating-point merging from interval edges coinciding with support points) and is voided.This descriptive distribution supports neither the 85% rule nor 80.7%, and it does not constitute a test of the 85% rule.</w:t>
+        <w:t xml:space="preserve">Further, we optimise the fusion estimator itself—sign-correcting each signal by its in-fit-block rank correlation (retaining the information of inversely signed signals rather than dropping the column) and split-half-reliability weighting per signal—yielding the </w:t>
+      </w:r>
+      <w:r>
+        <w:rPr>
+          <w:rFonts w:ascii="Courier New" w:hAnsi="Courier New"/>
+          <w:sz w:val="22"/>
+        </w:rPr>
+        <w:t>srw7</w:t>
+      </w:r>
+      <w:r>
+        <w:rPr>
+          <w:sz w:val="21"/>
+        </w:rPr>
+        <w:t xml:space="preserve"> estimator; under both record-level and student-level double holdout it is non-inferior to the "success-rate-only" baseline at every sample size and exceeds O8's fused6 at all brackets (record-level +3.823 / +2.025 / +0.930 / +0.391 / +0.138 pp; student-level +4.283 / +2.189 / +0.951 / +0.335 / +0.102 pp), eliminating fused6's harmfulness below baseline for k ≥ 25.Finally, we report the sliding-window error-rate distribution on assist09 (n = 286,150 windows; mean 0.3511).</w:t>
       </w:r>
     </w:p>
     <w:p>
@@ -242,7 +375,46 @@
         <w:rPr>
           <w:sz w:val="21"/>
         </w:rPr>
-        <w:t>The preregistered doubly robust (AIPW/DR) off-policy evaluation was executed on 2026-09-24 under a frozen identification strategy (LF-CIS-2026-09-22); the result detected no internal optimum and the Junyi time-inverted negative control was significant, so all dose–response readings are downgraded to associational evidence, and this paper makes no point estimate, confidence interval, or test of 15.87%.</w:t>
+        <w:t xml:space="preserve">At window width W = 20 it has only 21 discrete support points (k/20); recomputed by integer error counts, the single-value mode is an error rate of 0.25 (success rate 75%, 30,899 windows), while the 80–85% success band occupies only 19.64% of windows.The earlier-reported "mode interval 0.15–0.20 (success 80–85%)" was a binning-boundary artifact (floating-point merging from interval edges coinciding with support points) and is voided.This descriptive distribution is a distribution of </w:t>
+      </w:r>
+      <w:r>
+        <w:rPr>
+          <w:b/>
+          <w:sz w:val="21"/>
+        </w:rPr>
+        <w:t>experienced difficulty</w:t>
+      </w:r>
+      <w:r>
+        <w:rPr>
+          <w:sz w:val="21"/>
+        </w:rPr>
+        <w:t>; it does not constitute a test of the 85% rule or of the 80.7% value, and about either this paper says nothing.</w:t>
+      </w:r>
+    </w:p>
+    <w:p>
+      <w:pPr>
+        <w:spacing w:line="300" w:lineRule="auto" w:after="105"/>
+        <w:ind w:firstLine="0"/>
+        <w:jc w:val="both"/>
+      </w:pPr>
+      <w:r>
+        <w:rPr>
+          <w:sz w:val="21"/>
+        </w:rPr>
+        <w:t xml:space="preserve">The preregistered doubly robust (AIPW/DR) off-policy evaluation was executed on 2026-09-24, but </w:t>
+      </w:r>
+      <w:r>
+        <w:rPr>
+          <w:b/>
+          <w:sz w:val="21"/>
+        </w:rPr>
+        <w:t>it did not pass the preregistered positive-control criterion and its implementation differs from the frozen identification strategy (LF-CIS-2026-09-22); its results are therefore not interpretable</w:t>
+      </w:r>
+      <w:r>
+        <w:rPr>
+          <w:sz w:val="21"/>
+        </w:rPr>
+        <w:t>, and the causal side has been removed from this paper and transferred to the fourth paper (review §2.2, 2026-09-29).This paper makes no point estimate, confidence interval, or test of 15.87%.</w:t>
       </w:r>
     </w:p>
     <w:p>
@@ -2364,10 +2536,28 @@
         <w:rPr>
           <w:b/>
         </w:rPr>
-        <w:t>Execution note (2026-09-24):</w:t>
-      </w:r>
-      <w:r>
-        <w:t xml:space="preserve"> of the methods listed in this section, AIPW/DR and clustered bootstrap were executed under the frozen identification strategy (LF-CIS-2026-09-22); the dose uses the raw integer-error-count caliber solidified by that strategy (not the forward-calibrated version of the original preregistration), and the E-value and the formal ordering test of the five premises were not executed. Results are in §8.3: no internal optimum detected, and the Junyi negative control significant, so all readings are associational evidence. This section is retained so readers can compare the distance between the preregistered design and the actual execution.</w:t>
+        <w:t>Removal note (2026-09-29, review §2.2): of the methods listed in this section, AIPW/DR and the clustered bootstrap were executed on 2026-09-24 under the frozen identification strategy (LF-CIS-2026-09-22)</w:t>
+      </w:r>
+      <w:r>
+        <w:t>; the dose uses the raw-integer-error-count caliber solidified by that strategy (not the forward-calibrated version of the original preregistration), and the E-value and the formal ordering test of the five premises were not executed.</w:t>
+      </w:r>
+      <w:r>
+        <w:rPr>
+          <w:b/>
+        </w:rPr>
+        <w:t>That execution did not pass the positive-control criterion, and its implementation differs from the frozen document in four places (the ability-confounding caliber, the item-difficulty caliber, the time-inverted control window, and the treatment-window width); its results are therefore not interpretable and have been removed from this paper</w:t>
+      </w:r>
+      <w:r>
+        <w:t xml:space="preserve"> — see §8.3.</w:t>
+      </w:r>
+    </w:p>
+    <w:p>
+      <w:pPr>
+        <w:ind w:firstLine="360"/>
+        <w:jc w:val="both"/>
+      </w:pPr>
+      <w:r>
+        <w:t>This section is retained so that readers can compare the preregistered design with what was actually executed.</w:t>
       </w:r>
     </w:p>
     <w:p>
@@ -25351,7 +25541,7 @@
               <w:rPr>
                 <w:sz w:val="22"/>
               </w:rPr>
-              <w:t>Mode's bootstrap 95% set (200 resamples by student)</w:t>
+              <w:t>Mode's bootstrap 95% set (200 resamples by student, seed 20260922; review §3.3 requires ≥ 2,000 — rerun pending the assist09 source data)</w:t>
             </w:r>
           </w:p>
         </w:tc>
@@ -25382,7 +25572,7 @@
               <w:rPr>
                 <w:sz w:val="22"/>
               </w:rPr>
-              <w:t xml:space="preserve"> (occupies 95.5% of all resamples)</w:t>
+              <w:t xml:space="preserve"> (200-resample record: 95.5%; Monte Carlo standard error ≈ 1.5 percentage points)</w:t>
             </w:r>
           </w:p>
         </w:tc>
@@ -26370,7 +26560,7 @@
         <w:t>the single-value mode of the distribution is 75% success rate (error rate 0.25, 30,899 windows)</w:t>
       </w:r>
       <w:r>
-        <w:t xml:space="preserve">. This position is </w:t>
+        <w:t xml:space="preserve">.This position is </w:t>
       </w:r>
       <w:r>
         <w:rPr>
@@ -26379,16 +26569,25 @@
         <w:t>below</w:t>
       </w:r>
       <w:r>
-        <w:t xml:space="preserve"> Wilson et al.'s 84.13% and Baillifard et al.'s 80.7%, while the 80–85% success band occupies only 19.64% of all windows. Therefore, </w:t>
+        <w:t xml:space="preserve"> Wilson et al.'s 84.13% and Baillifard et al.'s 80.7%, while the 80–85% success band occupies only 19.64% of all windows.The 80–85% success band occupies only 19.64% of windows.</w:t>
       </w:r>
       <w:r>
         <w:rPr>
           <w:b/>
         </w:rPr>
-        <w:t>this distribution does not support the statement "the measured mode falls in the 80–85% band"</w:t>
-      </w:r>
-      <w:r>
-        <w:t>; if one says it is compatible with some candidate optimum, the only thing that can be said is that this band's window share (19.64%) is higher than any other 5-percentage-point-wide band, but that is a band-width effect, not evidence about the mode position.</w:t>
+        <w:t>But the mode is not the optimum (review §3.3, 2026-09-29)</w:t>
+      </w:r>
+      <w:r>
+        <w:t xml:space="preserve">: the most common speed on a motorway is 100 km/h, which does not show that 100 km/h is the most fuel-efficient — only that people drive that way.This distribution is likewise the distribution of </w:t>
+      </w:r>
+      <w:r>
+        <w:rPr>
+          <w:b/>
+        </w:rPr>
+        <w:t>experienced difficulty</w:t>
+      </w:r>
+      <w:r>
+        <w:t xml:space="preserve"> jointly produced by the ASSISTments item-allocation policy and student ability.</w:t>
       </w:r>
     </w:p>
     <w:p>
@@ -26397,16 +26596,52 @@
         <w:jc w:val="both"/>
       </w:pPr>
       <w:r>
-        <w:t xml:space="preserve">What it does not show is more important: under a discrete distribution the "mode" has no comparable interval width, and the gap between 84.13% and 80.7% is only about 3.4 percentage points—smaller than the support-point interval (5 percentage points) times one, so this evidence </w:t>
+        <w:t xml:space="preserve">Moreover the first rank (0.25; 30,899 windows) and the second (0.20; 30,061 windows) differ by only </w:t>
       </w:r>
       <w:r>
         <w:rPr>
           <w:b/>
         </w:rPr>
-        <w:t>cannot discriminate between these two candidate optima</w:t>
-      </w:r>
-      <w:r>
-        <w:t>. Any statement "this paper supports the 85% rule" or "this paper supports 80.7%" exceeds the information this distribution can bear. Moreover, the sliding-window error rate is the joint product of system allocation and student response, not an intervention on the dose, so it is not even a "descriptive dose–response," merely a "descriptive exposure distribution."</w:t>
+        <w:t>838 windows, 0.29% of the total</w:t>
+      </w:r>
+      <w:r>
+        <w:t xml:space="preserve">; the five support points spanning error rates 0.15–0.35 (k = 3…7) carry </w:t>
+      </w:r>
+      <w:r>
+        <w:rPr>
+          <w:b/>
+        </w:rPr>
+        <w:t>49.3%</w:t>
+      </w:r>
+      <w:r>
+        <w:t xml:space="preserve"> of all windows almost flatly (26,151 + 30,061 + 30,899 + 28,518 + 25,435 = 141,064 / 286,150).</w:t>
+      </w:r>
+      <w:r>
+        <w:rPr>
+          <w:b/>
+        </w:rPr>
+        <w:t>This paper therefore reports the shape of the distribution (its flatness over that interval) rather than the position of the mode</w:t>
+      </w:r>
+      <w:r>
+        <w:t xml:space="preserve">, and states explicitly that this distribution </w:t>
+      </w:r>
+      <w:r>
+        <w:rPr>
+          <w:b/>
+        </w:rPr>
+        <w:t>constitutes no test of any optimal error rate</w:t>
+      </w:r>
+      <w:r>
+        <w:t xml:space="preserve">.The sentence previously written here — that this distribution does not support the claim that the measured mode falls in the 80–85% band — </w:t>
+      </w:r>
+      <w:r>
+        <w:rPr>
+          <w:b/>
+        </w:rPr>
+        <w:t>has been deleted</w:t>
+      </w:r>
+      <w:r>
+        <w:t>.</w:t>
       </w:r>
     </w:p>
     <w:p>
@@ -26415,40 +26650,16 @@
         <w:jc w:val="both"/>
       </w:pPr>
       <w:r>
+        <w:t xml:space="preserve">What it does not show is more important: under a discrete distribution the "mode" has no comparable interval width, and the gap between 84.13% and 80.7% is only about 3.4 percentage points—smaller than the support-point interval (5 percentage points) times one, so this evidence </w:t>
+      </w:r>
+      <w:r>
         <w:rPr>
           <w:b/>
         </w:rPr>
-        <w:t>On the testability of the RQ2 decision rule.</w:t>
-      </w:r>
-      <w:r>
-        <w:t xml:space="preserve"> An earlier version wrote RQ2's falsification condition as "if the sliding-window error-rate mode significantly deviates from [0.15, 0.20], then falsify." Under the discrete-support-point caliber this condition </w:t>
-      </w:r>
-      <w:r>
-        <w:rPr>
-          <w:b/>
-        </w:rPr>
-        <w:t>cannot be tested as is</w:t>
-      </w:r>
-      <w:r>
-        <w:t xml:space="preserve">: the single-value mode is 0.25, already outside the interval, but "significant deviation" requires a distributional quantity (confidence interval).This paper's approach is to </w:t>
-      </w:r>
-      <w:r>
-        <w:rPr>
-          <w:b/>
-        </w:rPr>
-        <w:t>bootstrap the discrete distribution by student resampling and define the uncertainty by the resample distribution of the mode support point</w:t>
-      </w:r>
-      <w:r>
-        <w:t xml:space="preserve"> (the 95% set is given in Table 8-1 above).With current evidence, the mode support point is stably k = 5 in 95.5% of resamples, so the description "mode = 0.25" is stable, while the statement "the mode falls in the 80–85% band" </w:t>
-      </w:r>
-      <w:r>
-        <w:rPr>
-          <w:b/>
-        </w:rPr>
-        <w:t>is falsified</w:t>
-      </w:r>
-      <w:r>
-        <w:t>.</w:t>
+        <w:t>cannot discriminate between these two candidate optima</w:t>
+      </w:r>
+      <w:r>
+        <w:t>. Any statement "this paper supports the 85% rule" or "this paper supports 80.7%" exceeds the information this distribution can bear. Moreover, the sliding-window error rate is the joint product of system allocation and student response, not an intervention on the dose, so it is not even a "descriptive dose–response," merely a "descriptive exposure distribution."</w:t>
       </w:r>
     </w:p>
     <w:p>
@@ -26457,21 +26668,31 @@
         <w:jc w:val="both"/>
       </w:pPr>
       <w:r>
-        <w:t>The causal-side proposition of RQ2 (whether the optimal error rate on real learners equals 15.87%) was executed on 2026-09-24 under a frozen identification strategy: no internal optimum detected, and the Junyi time-inverted negative control significant, downgrading to associational evidence (see §8.3), so that proposition still receives no causal-grade answer.</w:t>
-      </w:r>
-    </w:p>
-    <w:p>
-      <w:pPr>
-        <w:pStyle w:val="Heading3"/>
-      </w:pPr>
-      <w:r>
-        <w:rPr>
-          <w:rFonts w:ascii="Times New Roman" w:hAnsi="Times New Roman"/>
+        <w:rPr>
           <w:b/>
-          <w:color w:val="000000"/>
-          <w:sz w:val="24"/>
-        </w:rPr>
-        <w:t>8.3 Execution of the causal side: preregistered AIPW/DR executed under a frozen identification strategy (2026-09-24 supplement)</w:t>
+        </w:rPr>
+        <w:t>On the testability of the RQ2 decision rule — the decision rule is abolished (review §3.3, 2026-09-29).</w:t>
+      </w:r>
+      <w:r>
+        <w:t xml:space="preserve"> An earlier version wrote RQ2's falsification condition as "if the sliding-window error-rate mode significantly deviates from [0.15, 0.20], then falsify." Under the discrete-support-point caliber this condition </w:t>
+      </w:r>
+      <w:r>
+        <w:rPr>
+          <w:b/>
+        </w:rPr>
+        <w:t>cannot be tested as is</w:t>
+      </w:r>
+      <w:r>
+        <w:t xml:space="preserve">: the single-value mode is 0.25, already outside the interval, but "significant deviation" requires a distributional quantity (confidence interval).This paper's approach is to </w:t>
+      </w:r>
+      <w:r>
+        <w:rPr>
+          <w:b/>
+        </w:rPr>
+        <w:t>bootstrap the discrete distribution by student resampling and define the uncertainty by the resample distribution of the mode support point</w:t>
+      </w:r>
+      <w:r>
+        <w:t xml:space="preserve"> (the 95% set is given in Table 8-1 above).</w:t>
       </w:r>
     </w:p>
     <w:p>
@@ -26480,17 +26701,16 @@
         <w:jc w:val="both"/>
       </w:pPr>
       <w:r>
-        <w:t xml:space="preserve">The causal-side design of the original preregistration (dose construction, endpoint definition, AIPW/DR estimation, non-monotonicity test, supporting robustness procedures) was executed on three public logs under the identification strategy of "freeze first, then touch the endpoint" (LF-CIS-2026-09-22, frozen 2026-09-22, prior to any endpoint-variable contact; the freeze-document hash, input-file hashes, script hash, and run log are in </w:t>
-      </w:r>
-      <w:r>
-        <w:rPr>
-          <w:rFonts w:ascii="Courier New" w:hAnsi="Courier New"/>
-          <w:sz w:val="22"/>
-        </w:rPr>
-        <w:t>results/m1/aipw/aipw_audit.log</w:t>
-      </w:r>
-      <w:r>
-        <w:t>).</w:t>
+        <w:t xml:space="preserve">With current evidence, the mode support point is stably k = 5 in 95.5% of resamples, so the description "mode = 0.25" is stable, while the statement "the mode falls in the 80–85% band" </w:t>
+      </w:r>
+      <w:r>
+        <w:rPr>
+          <w:b/>
+        </w:rPr>
+        <w:t>is falsified</w:t>
+      </w:r>
+      <w:r>
+        <w:t>.The causal-side proposition of RQ2 (whether the optimal error rate on real learners equals 15.87%) was executed on 2026-09-24 under a frozen identification strategy: no internal optimum detected, and the Junyi time-inverted negative control significant, downgrading to associational evidence (see §8.3), so that proposition still receives no causal-grade answer.</w:t>
       </w:r>
     </w:p>
     <w:p>
@@ -26499,7 +26719,40 @@
         <w:jc w:val="both"/>
       </w:pPr>
       <w:r>
-        <w:t>The dose uses the raw-integer-error-count caliber solidified by that strategy, d = k/20 (W=20 window; not the forward-calibrated version of the original preregistration—that substitution is solidified by freeze-document §3.1, to avoid floating-point merging); endpoint = number of steps needed for the first three consecutive correct items within the outcome window (within-item rank-transformed to the main); estimator = cross-fitted AIPW/DR (random-forest outcome regression + 21-bracket multiclass generalised propensity, 5-fold split by learner), with IPW / regression / same-bracket nearest-neighbour matching as three parallel controls, learner-clustered bootstrap (500 times) and BH-FDR (q=0.05).</w:t>
+        <w:rPr>
+          <w:b/>
+        </w:rPr>
+        <w:t>Abolition of the RQ2 decision rule, and the reporting caliber of this section (review §3.3, 2026-09-29).</w:t>
+      </w:r>
+      <w:r>
+        <w:t xml:space="preserve"> An earlier version wrote RQ2's falsification condition as: if the sliding-window error-rate mode significantly deviates from [0.15, 0.20], then falsify; and the proposal (§3.2) wrote it as: if the confidence set excludes 0.1587 and 0.193, neither candidate is supported.</w:t>
+      </w:r>
+      <w:r>
+        <w:rPr>
+          <w:b/>
+        </w:rPr>
+        <w:t>Both decision rules are abolished</w:t>
+      </w:r>
+      <w:r>
+        <w:t xml:space="preserve">: the support points are only multiples of 0.05 (k/20), and 0.1587 and 0.193 </w:t>
+      </w:r>
+      <w:r>
+        <w:rPr>
+          <w:b/>
+        </w:rPr>
+        <w:t>could never have entered</w:t>
+      </w:r>
+      <w:r>
+        <w:t xml:space="preserve"> any confidence set built from support points, so the rule returns refuted regardless of the data — it tests the discreteness of the support grid, not the optimal error rate.More fundamentally, the mode is not the optimum (see the motorway-speed analogy above), so </w:t>
+      </w:r>
+      <w:r>
+        <w:rPr>
+          <w:b/>
+        </w:rPr>
+        <w:t>nothing about the 85% rule or about 80.7% follows from the fact that the mode is 0.25</w:t>
+      </w:r>
+      <w:r>
+        <w:t>.</w:t>
       </w:r>
     </w:p>
     <w:p>
@@ -26508,7 +26761,25 @@
         <w:jc w:val="both"/>
       </w:pPr>
       <w:r>
-        <w:t>Samples: assist09 n=1,019, Junyi n=24,079 (qualified units, criterion that the learner has ≥41 cumulative responses on that knowledge point), DBE n=35 (does not meet the main-test scale, archived only, not entering the main test).</w:t>
+        <w:t xml:space="preserve">Accordingly this section is repositioned as: </w:t>
+      </w:r>
+      <w:r>
+        <w:rPr>
+          <w:b/>
+        </w:rPr>
+        <w:t>the sliding-window error-rate distribution is descriptive statistics of experienced difficulty, not a test of an optimal value</w:t>
+      </w:r>
+      <w:r>
+        <w:t xml:space="preserve">.This section reports the distribution shape (flat over 0.15–0.35, 49.3%) and the resampling stability of the mode (k = 5 in 95.5% of 200 bootstrap resamples; Monte Carlo standard error ≈ 1.5 percentage points, just above the 95% threshold), </w:t>
+      </w:r>
+      <w:r>
+        <w:rPr>
+          <w:b/>
+        </w:rPr>
+        <w:t>but no longer judges any candidate optimum on that basis</w:t>
+      </w:r>
+      <w:r>
+        <w:t>.</w:t>
       </w:r>
     </w:p>
     <w:p>
@@ -26517,34 +26788,107 @@
         <w:jc w:val="both"/>
       </w:pPr>
       <w:r>
-        <w:t xml:space="preserve">The result is </w:t>
+        <w:t xml:space="preserve">Per review §3.3 the bootstrap must be raised to </w:t>
       </w:r>
       <w:r>
         <w:rPr>
           <w:b/>
         </w:rPr>
-        <w:t>negative, and the negative control is significant on Junyi</w:t>
-      </w:r>
-      <w:r>
-        <w:t xml:space="preserve">.First, </w:t>
+        <w:t>≥ 2,000</w:t>
+      </w:r>
+      <w:r>
+        <w:t xml:space="preserve"> resamples with the distribution shape as the reported object; </w:t>
+      </w:r>
+      <w:r>
+        <w:rPr>
+          <w:rFonts w:ascii="Courier New" w:hAnsi="Courier New"/>
+          <w:sz w:val="22"/>
+        </w:rPr>
+        <w:t>BOOT</w:t>
+      </w:r>
+      <w:r>
+        <w:t xml:space="preserve"> in </w:t>
+      </w:r>
+      <w:r>
+        <w:rPr>
+          <w:rFonts w:ascii="Courier New" w:hAnsi="Courier New"/>
+          <w:sz w:val="22"/>
+        </w:rPr>
+        <w:t>results/code/m1_real_data.py</w:t>
+      </w:r>
+      <w:r>
+        <w:t xml:space="preserve"> has been changed to 2000 accordingly, but </w:t>
       </w:r>
       <w:r>
         <w:rPr>
           <w:b/>
         </w:rPr>
-        <w:t>no internal optimum in the preregistered sense was detected</w:t>
-      </w:r>
-      <w:r>
-        <w:t>: on the two detectable datasets μ(d) did not fall below both endpoints in ≥95% of bootstrap replications (assist09 d</w:t>
-      </w:r>
-      <w:r>
-        <w:rPr>
-          <w:i/>
-        </w:rPr>
-        <w:t>=2, low-end exceedance probability 0.94; Junyi d</w:t>
-      </w:r>
-      <w:r>
-        <w:t>=3, low-end exceedance probability 0.40).</w:t>
+        <w:t>the rerun needs the original assist09 data (</w:t>
+      </w:r>
+      <w:r>
+        <w:rPr>
+          <w:rFonts w:ascii="Courier New" w:hAnsi="Courier New"/>
+          <w:b/>
+          <w:sz w:val="22"/>
+        </w:rPr>
+        <w:t>data/assist09_corrected.csv</w:t>
+      </w:r>
+      <w:r>
+        <w:rPr>
+          <w:b/>
+        </w:rPr>
+        <w:t>), which is not present in this working copy</w:t>
+      </w:r>
+      <w:r>
+        <w:t xml:space="preserve">, so the 2,000-resample result is marked as pending rerun and the 200-resample figures above are retained as a record only, not as a basis for conclusions.It is also noted that Wilson et al.'s optimal error rate under Cauchy noise happens also to be 0.25; </w:t>
+      </w:r>
+      <w:r>
+        <w:rPr>
+          <w:b/>
+        </w:rPr>
+        <w:t>this paper claims nothing from that coincidence.</w:t>
+      </w:r>
+    </w:p>
+    <w:p>
+      <w:pPr>
+        <w:pStyle w:val="Heading3"/>
+      </w:pPr>
+      <w:r>
+        <w:rPr>
+          <w:rFonts w:ascii="Times New Roman" w:hAnsi="Times New Roman"/>
+          <w:b/>
+          <w:color w:val="000000"/>
+          <w:sz w:val="24"/>
+        </w:rPr>
+        <w:t>8.3 The causal side — removed from this paper (review §2.2, 2026-09-29)</w:t>
+      </w:r>
+    </w:p>
+    <w:p>
+      <w:pPr>
+        <w:spacing w:after="120"/>
+        <w:ind w:firstLine="0"/>
+        <w:jc w:val="both"/>
+      </w:pPr>
+      <w:r>
+        <w:t>&amp;nbsp;&amp;nbsp;</w:t>
+      </w:r>
+      <w:r>
+        <w:rPr>
+          <w:b/>
+        </w:rPr>
+        <w:t>Removal statement.</w:t>
+      </w:r>
+      <w:r>
+        <w:t xml:space="preserve"> Per review §2.2, the causal side (former §2.5, this section, and the H4/H5 rows of §8.4) </w:t>
+      </w:r>
+      <w:r>
+        <w:rPr>
+          <w:b/>
+        </w:rPr>
+        <w:t>has been removed from M1</w:t>
+      </w:r>
+      <w:r>
+        <w:t xml:space="preserve"> and transferred to the fourth paper, i.e. row 4 of the table in §7.1 of the dissertation proposal. This section no longer carries any causal claim about the optimal error rate, and no longer reports a dose–response curve, the shape of μ(d), an internal optimum location, or positive/negative-control readings.</w:t>
       </w:r>
     </w:p>
     <w:p>
@@ -26553,34 +26897,57 @@
         <w:jc w:val="both"/>
       </w:pPr>
       <w:r>
-        <w:t xml:space="preserve">Second, μ(d) </w:t>
-      </w:r>
-      <w:r>
         <w:rPr>
           <w:b/>
         </w:rPr>
-        <w:t>rises overall with dose</w:t>
-      </w:r>
-      <w:r>
-        <w:t xml:space="preserve">—the more prior errors, the slower the mastery—with naïve means in the same direction (assist09 mean steps 3.0→9.2→18.9; Junyi 4.42→8.62→15.48), opposite to the U-shape prediction of "moderate error is beneficial." Third, </w:t>
+        <w:t>The only retained conclusion of the version-1 execution (one paragraph):</w:t>
+      </w:r>
+    </w:p>
+    <w:p>
+      <w:pPr>
+        <w:spacing w:after="120"/>
+        <w:ind w:firstLine="0"/>
+        <w:jc w:val="both"/>
+      </w:pPr>
+      <w:r>
+        <w:t xml:space="preserve">&amp;nbsp;&amp;nbsp;The preregistered AIPW/DR dose–response analysis was executed on 2026-09-24 on three public logs (assist09, Junyi, DBE-KT22; </w:t>
+      </w:r>
+      <w:r>
+        <w:rPr>
+          <w:rFonts w:ascii="Courier New" w:hAnsi="Courier New"/>
+          <w:sz w:val="22"/>
+        </w:rPr>
+        <w:t>results/m1/aipw/aipw_results.json</w:t>
+      </w:r>
+      <w:r>
+        <w:t xml:space="preserve">). That execution </w:t>
       </w:r>
       <w:r>
         <w:rPr>
           <w:b/>
         </w:rPr>
-        <w:t>Junyi's time-inverted negative control is significant</w:t>
-      </w:r>
-      <w:r>
-        <w:t xml:space="preserve"> (the inverted window also shows d*=3 "internal optimum," endpoints exceedance 1.000/0.998); per the handling convention of identification-strategy §6.2: do not explain it away, report it honestly, and all dose–response conclusions in this section are </w:t>
+        <w:t>did not pass the positive-control criterion</w:t>
+      </w:r>
+      <w:r>
+        <w:t xml:space="preserve">, and its </w:t>
       </w:r>
       <w:r>
         <w:rPr>
           <w:b/>
         </w:rPr>
-        <w:t>downgraded to associational evidence</w:t>
-      </w:r>
-      <w:r>
-        <w:t>, constituting no causal identification of the optimal error rate.</w:t>
+        <w:t>implementation differs from the frozen identification strategy (LF-CIS-2026-09-22)</w:t>
+      </w:r>
+      <w:r>
+        <w:t xml:space="preserve">; its results are therefore </w:t>
+      </w:r>
+      <w:r>
+        <w:rPr>
+          <w:b/>
+        </w:rPr>
+        <w:t>not interpretable</w:t>
+      </w:r>
+      <w:r>
+        <w:t>, and this paper makes no confirmatory reading of them.</w:t>
       </w:r>
     </w:p>
     <w:p>
@@ -26589,25 +26956,141 @@
         <w:jc w:val="both"/>
       </w:pPr>
       <w:r>
-        <w:t>Window-width robustness (required by identification-strategy §11.2, W=10/40) shows the same pattern: W=10 (Junyi n=49,075) reproduces "no detection + significant negative control"; W=40 (Junyi n=8,056) does detect an internal optimum on both datasets (assist09 d</w:t>
-      </w:r>
-      <w:r>
-        <w:rPr>
-          <w:i/>
-        </w:rPr>
-        <w:t>=9, Junyi d</w:t>
-      </w:r>
-      <w:r>
-        <w:t xml:space="preserve">=4), but </w:t>
-      </w:r>
+        <w:t>The three grounds for that judgement, item by item, follow review §2.2:</w:t>
+      </w:r>
+    </w:p>
+    <w:p>
+      <w:pPr>
+        <w:pStyle w:val="ListNumber"/>
+        <w:numPr>
+          <w:ilvl w:val="0"/>
+          <w:numId w:val="10"/>
+        </w:numPr>
+        <w:spacing w:after="120"/>
+        <w:jc w:val="both"/>
+      </w:pPr>
       <w:r>
         <w:rPr>
           <w:b/>
         </w:rPr>
-        <w:t>precisely at this window width the negative controls on both datasets are also significant</w:t>
-      </w:r>
-      <w:r>
-        <w:t xml:space="preserve"> (low-end exceedance 0.998/1.000 and 1.000/1.000)—i.e., the "internal optimum" appears only at the window width confounded by the time trend, and at no window width is there a defensible causal-grade internal-optimum claim.</w:t>
+        <w:t>The positive control did not pass the frozen rule.</w:t>
+      </w:r>
+      <w:r>
+        <w:t xml:space="preserve"> §6.1 of the frozen document requires that the all-correct (error rate 0) and all-incorrect brackets be "significantly slower; if not significant, the estimator has no detection capability on this data and the negative result of the main analysis is not interpretable." Under the executing script's criterion (bootstrap probability that k = 0 and k = 20 are slower than k = 10, both &gt; 0.95), the measured values are assist09 0.000 / 0.63, DBE 0.312 / 0.646, Junyi 0.002 / 1.000 — </w:t>
+      </w:r>
+      <w:r>
+        <w:rPr>
+          <w:b/>
+        </w:rPr>
+        <w:t>none of the three datasets passed</w:t>
+      </w:r>
+      <w:r>
+        <w:t xml:space="preserve">. An earlier version of this paper wrote that "the estimator itself has detection capability (p = 0.002 and p = 1.000)": the 0.002 is in the direction </w:t>
+      </w:r>
+      <w:r>
+        <w:rPr>
+          <w:b/>
+        </w:rPr>
+        <w:t>opposite</w:t>
+      </w:r>
+      <w:r>
+        <w:t xml:space="preserve"> to the prediction, and 1.000 is a bootstrap proportion, not a p-value — that reading contradicts the frozen rule and </w:t>
+      </w:r>
+      <w:r>
+        <w:rPr>
+          <w:b/>
+        </w:rPr>
+        <w:t>has been deleted</w:t>
+      </w:r>
+      <w:r>
+        <w:t>. There is also a more fundamental problem: this "positive control" presupposes the very U-shaped hypothesis under test, so it is not a control with a known effect and could not have served as a positive control from the outset.</w:t>
+      </w:r>
+    </w:p>
+    <w:p>
+      <w:pPr>
+        <w:pStyle w:val="ListNumber"/>
+        <w:numPr>
+          <w:ilvl w:val="0"/>
+          <w:numId w:val="10"/>
+        </w:numPr>
+        <w:spacing w:after="120"/>
+        <w:jc w:val="both"/>
+      </w:pPr>
+      <w:r>
+        <w:rPr>
+          <w:b/>
+        </w:rPr>
+        <w:t>Identification does not hold.</w:t>
+      </w:r>
+      <w:r>
+        <w:t xml:space="preserve"> The variation of the treatment (number of errors in the first 20 items) mixes learner ability, the system's item selection, learning progress and randomness; the outcome (number of steps to the first three consecutive correct responses within the next 20 items) reads the ability and progress of the </w:t>
+      </w:r>
+      <w:r>
+        <w:rPr>
+          <w:b/>
+        </w:rPr>
+        <w:t>same learner on the same knowledge point</w:t>
+      </w:r>
+      <w:r>
+        <w:t>. As long as ability is persistent, the monotone shape "learners who erred more earlier are also slower later" arises mechanically. The significance of the time-inverted negative control is consistent with this explanation.</w:t>
+      </w:r>
+    </w:p>
+    <w:p>
+      <w:pPr>
+        <w:pStyle w:val="ListNumber"/>
+        <w:numPr>
+          <w:ilvl w:val="0"/>
+          <w:numId w:val="10"/>
+        </w:numPr>
+        <w:spacing w:after="120"/>
+        <w:jc w:val="both"/>
+      </w:pPr>
+      <w:r>
+        <w:rPr>
+          <w:b/>
+        </w:rPr>
+        <w:t>The implementation differs from the frozen document.</w:t>
+      </w:r>
+      <w:r>
+        <w:t xml:space="preserve"> (i) Ability confounding: the document specifies "IRT-1PL θ̂ fitted from responses prior to the treatment window," whereas the code uses the logit of the empirical accuracy over the first half of the responses prior to the treatment window; item difficulty: the document specifies expert labels or IRT difficulty, whereas the code uses the mean learner self-reported difficulty on DBE and the knowledge-point global accuracy on assist09. (ii) In the time-inverted negative control, the code sets the "pre-treatment" window to the same interval as the outcome window (</w:t>
+      </w:r>
+      <w:r>
+        <w:rPr>
+          <w:rFonts w:ascii="Courier New" w:hAnsi="Courier New"/>
+          <w:sz w:val="22"/>
+        </w:rPr>
+        <w:t>seq[0:20]</w:t>
+      </w:r>
+      <w:r>
+        <w:t xml:space="preserve">) and computes θ̂ from that interval, so the outcome variable enters the confounding adjustment and this control's result cannot be read at face value either. (iii) </w:t>
+      </w:r>
+      <w:r>
+        <w:rPr>
+          <w:b/>
+        </w:rPr>
+        <w:t>The former W = 10/40 "window-width robustness" did not change the window width</w:t>
+      </w:r>
+      <w:r>
+        <w:t xml:space="preserve"> — the code that extracts the treatment window, </w:t>
+      </w:r>
+      <w:r>
+        <w:rPr>
+          <w:rFonts w:ascii="Courier New" w:hAnsi="Courier New"/>
+          <w:sz w:val="22"/>
+        </w:rPr>
+        <w:t>seq[e-19:e+1]</w:t>
+      </w:r>
+      <w:r>
+        <w:t xml:space="preserve">, is fixed at 20 items; only the number of dose brackets changed. That statement </w:t>
+      </w:r>
+      <w:r>
+        <w:rPr>
+          <w:b/>
+        </w:rPr>
+        <w:t>has been deleted</w:t>
+      </w:r>
+      <w:r>
+        <w:t>.</w:t>
       </w:r>
     </w:p>
     <w:p>
@@ -26616,25 +27099,41 @@
         <w:jc w:val="both"/>
       </w:pPr>
       <w:r>
-        <w:t xml:space="preserve">Therefore this paper </w:t>
-      </w:r>
-      <w:r>
         <w:rPr>
           <w:b/>
         </w:rPr>
-        <w:t>still reports no point estimate, confidence interval, or test against 0.1587 for any ê\</w:t>
-      </w:r>
-      <w:r>
-        <w:t>* (that test presupposes the existence of an internal optimum, a premise not supported), and makes no directional assertion about whether "the optimal error rate on real learners equals 15.87%." Compared with the earlier state of "causal side not executed," the change is substantive: the preregistered estimator has produced and traced its output, with the conclusion "not detected"; the estimator itself has detection capability (in the positive-control P-pos-1, Junyi k=0 vs.k=W dose difference vs.the middle is detected with bootstrap probability p=0.002 and p=1.000 respectively)—it is just that the detected shape is monotone (or confounded), not U-shaped.</w:t>
-      </w:r>
-    </w:p>
-    <w:p>
-      <w:pPr>
-        <w:ind w:firstLine="360"/>
-        <w:jc w:val="both"/>
-      </w:pPr>
-      <w:r>
-        <w:t>Unexecuted items are honestly retained: E-value, the formal ordering test of the five premises, P-pos-2 (randomised-simulation arm, unconditionally executable), P-neg-1 (no mechanism-independent contemporaneous endpoint exists in the public logs).The H-c3 exploratory stratification (hint rate × item type) is entirely unestimable because each stratum has n&lt;3000, reported honestly.</w:t>
+        <w:t>Follow-up.</w:t>
+      </w:r>
+      <w:r>
+        <w:t xml:space="preserve"> Version 2 of the identification strategy must be submitted </w:t>
+      </w:r>
+      <w:r>
+        <w:rPr>
+          <w:b/>
+        </w:rPr>
+        <w:t>before execution</w:t>
+      </w:r>
+      <w:r>
+        <w:t xml:space="preserve"> and tagged (the executing script reads that tag and writes its hash into the results JSON); where the implementation differs from the document, the document must be amended and resubmitted first. Version 2 must state where the variation of the treatment variable comes from, and on what basis that variation is taken to be independent of the outcome. </w:t>
+      </w:r>
+      <w:r>
+        <w:rPr>
+          <w:b/>
+        </w:rPr>
+        <w:t>If no basis for identification can be established on observational logs, the work moves to the randomised-assignment experiment</w:t>
+      </w:r>
+      <w:r>
+        <w:t xml:space="preserve"> (the design in §11 of the proposal). The 10 October interview must bring the original </w:t>
+      </w:r>
+      <w:r>
+        <w:rPr>
+          <w:rFonts w:ascii="Courier New" w:hAnsi="Courier New"/>
+          <w:sz w:val="22"/>
+        </w:rPr>
+        <w:t>aipw_audit.log</w:t>
+      </w:r>
+      <w:r>
+        <w:t xml:space="preserve"> and the filesystem timestamps of the frozen document, to show that freezing preceded execution.</w:t>
       </w:r>
     </w:p>
     <w:p>
@@ -27076,13 +27575,13 @@
                 <w:b/>
                 <w:sz w:val="22"/>
               </w:rPr>
-              <w:t>Executed (2026-09-24), premise not supported</w:t>
-            </w:r>
-            <w:r>
-              <w:rPr>
-                <w:sz w:val="22"/>
-              </w:rPr>
-              <w:t xml:space="preserve"> : preregistered AIPW/DR detected no internal optimum (§8.3), the "optimal-position" test's premise fails, so no point test against 15.87% is reported</w:t>
+              <w:t>Removed from this paper</w:t>
+            </w:r>
+            <w:r>
+              <w:rPr>
+                <w:sz w:val="22"/>
+              </w:rPr>
+              <w:t xml:space="preserve"> : transferred to the fourth paper (causal side); the executed AIPW/DR did not pass the preregistered positive-control criterion and its implementation differs from the frozen document, hence is not interpretable (§8.3), the "optimal-position" test's premise fails, so no point test against 15.87% is reported</w:t>
             </w:r>
           </w:p>
         </w:tc>
@@ -27157,13 +27656,13 @@
                 <w:b/>
                 <w:sz w:val="22"/>
               </w:rPr>
-              <w:t>Executed (2026-09-24), U-shape not supported</w:t>
-            </w:r>
-            <w:r>
-              <w:rPr>
-                <w:sz w:val="22"/>
-              </w:rPr>
-              <w:t xml:space="preserve"> : μ(d) rises overall with dose (more prior errors, slower mastery); Junyi time-inverted negative control significant, all readings downgraded to associational evidence (§8.3)</w:t>
+              <w:t>Removed from this paper (2026-09-29, review §2.2)</w:t>
+            </w:r>
+            <w:r>
+              <w:rPr>
+                <w:sz w:val="22"/>
+              </w:rPr>
+              <w:t xml:space="preserve"> : as above, the readings are not interpretable (§8.3), transferred to the fourth paper. The former W = 10/40 window-width robustness statement is invalid because the treatment window is fixed at 20 items, and has been deleted</w:t>
             </w:r>
           </w:p>
         </w:tc>
@@ -27775,75 +28274,6 @@
       </w:pPr>
       <w:r>
         <w:t>Part of the above conclusions has landed in the studied system's code layer, in three places (the first two covered by regression tests, the third by an external verification script):</w:t>
-      </w:r>
-    </w:p>
-    <w:p>
-      <w:pPr>
-        <w:pStyle w:val="ListNumber"/>
-        <w:numPr>
-          <w:ilvl w:val="0"/>
-          <w:numId w:val="10"/>
-        </w:numPr>
-        <w:spacing w:after="120"/>
-        <w:jc w:val="both"/>
-      </w:pPr>
-      <w:r>
-        <w:rPr>
-          <w:b/>
-        </w:rPr>
-        <w:t>New difficulty-metric layer</w:t>
-      </w:r>
-      <w:r>
-        <w:t xml:space="preserve"> </w:t>
-      </w:r>
-      <w:r>
-        <w:rPr>
-          <w:rFonts w:ascii="Courier New" w:hAnsi="Courier New"/>
-          <w:sz w:val="22"/>
-        </w:rPr>
-        <w:t>learnflow-backend/app/services/difficulty_fusion.py</w:t>
-      </w:r>
-      <w:r>
-        <w:t xml:space="preserve">, providing three functions: </w:t>
-      </w:r>
-      <w:r>
-        <w:rPr>
-          <w:rFonts w:ascii="Courier New" w:hAnsi="Courier New"/>
-          <w:sz w:val="22"/>
-        </w:rPr>
-        <w:t>ecdf_logit()</w:t>
-      </w:r>
-      <w:r>
-        <w:t xml:space="preserve"> (empirical CDF → logit quantile linking, invariant to any monotone reparameterisation, corresponding to O1's 1 × 10⁻⁴ property), </w:t>
-      </w:r>
-      <w:r>
-        <w:rPr>
-          <w:rFonts w:ascii="Courier New" w:hAnsi="Courier New"/>
-          <w:sz w:val="22"/>
-        </w:rPr>
-        <w:t>fuse_signals()</w:t>
-      </w:r>
-      <w:r>
-        <w:t xml:space="preserve"> (multi-behavioural-signal rank fusion, corresponding to O4 / O5 conclusions), </w:t>
-      </w:r>
-      <w:r>
-        <w:rPr>
-          <w:rFonts w:ascii="Courier New" w:hAnsi="Courier New"/>
-          <w:sz w:val="22"/>
-        </w:rPr>
-        <w:t>logit_to_fsrs()</w:t>
-      </w:r>
-      <w:r>
-        <w:t xml:space="preserve"> (in-batch mapping to FSRS's [1, 10] interval). The module docstring writes in O1 / O3 / O4 / O5 numbers, and writes in </w:t>
-      </w:r>
-      <w:r>
-        <w:rPr>
-          <w:b/>
-        </w:rPr>
-        <w:t>O3's negative-result warning: prohibit using knowledge-tree depth as a difficulty proxy</w:t>
-      </w:r>
-      <w:r>
-        <w:t>.</w:t>
       </w:r>
     </w:p>
     <w:p>
@@ -27860,7 +28290,7 @@
         <w:rPr>
           <w:b/>
         </w:rPr>
-        <w:t>Modified</w:t>
+        <w:t>New difficulty-metric layer</w:t>
       </w:r>
       <w:r>
         <w:t xml:space="preserve"> </w:t>
@@ -27870,30 +28300,49 @@
           <w:rFonts w:ascii="Courier New" w:hAnsi="Courier New"/>
           <w:sz w:val="22"/>
         </w:rPr>
-        <w:t>learnflow-backend/app/services/optimal_difficulty.py</w:t>
-      </w:r>
-      <w:r>
-        <w:t xml:space="preserve">'s </w:t>
+        <w:t>learnflow-backend/app/services/difficulty_fusion.py</w:t>
+      </w:r>
+      <w:r>
+        <w:t xml:space="preserve">, providing three functions: </w:t>
       </w:r>
       <w:r>
         <w:rPr>
           <w:rFonts w:ascii="Courier New" w:hAnsi="Courier New"/>
           <w:sz w:val="22"/>
         </w:rPr>
-        <w:t>update_task_difficulty</w:t>
-      </w:r>
-      <w:r>
-        <w:t xml:space="preserve">: replaced the time-consuming </w:t>
+        <w:t>ecdf_logit()</w:t>
+      </w:r>
+      <w:r>
+        <w:t xml:space="preserve"> (empirical CDF → logit quantile linking, invariant to any monotone reparameterisation, corresponding to O1's 1 × 10⁻⁴ property), </w:t>
       </w:r>
       <w:r>
         <w:rPr>
           <w:rFonts w:ascii="Courier New" w:hAnsi="Courier New"/>
           <w:sz w:val="22"/>
         </w:rPr>
-        <w:t>&gt;180s</w:t>
-      </w:r>
-      <w:r>
-        <w:t xml:space="preserve"> hard-threshold bracketing with a log-time continuous monotonic soft term s = σ(ln(t/60)/0.8), and added a hint penalty (O5 shows hint rate is an effective difficulty signal); the old behaviour contract "lower difficulty after fast correct" is preserved.</w:t>
+        <w:t>fuse_signals()</w:t>
+      </w:r>
+      <w:r>
+        <w:t xml:space="preserve"> (multi-behavioural-signal rank fusion, corresponding to O4 / O5 conclusions), </w:t>
+      </w:r>
+      <w:r>
+        <w:rPr>
+          <w:rFonts w:ascii="Courier New" w:hAnsi="Courier New"/>
+          <w:sz w:val="22"/>
+        </w:rPr>
+        <w:t>logit_to_fsrs()</w:t>
+      </w:r>
+      <w:r>
+        <w:t xml:space="preserve"> (in-batch mapping to FSRS's [1, 10] interval). The module docstring writes in O1 / O3 / O4 / O5 numbers, and writes in </w:t>
+      </w:r>
+      <w:r>
+        <w:rPr>
+          <w:b/>
+        </w:rPr>
+        <w:t>O3's negative-result warning: prohibit using knowledge-tree depth as a difficulty proxy</w:t>
+      </w:r>
+      <w:r>
+        <w:t>.</w:t>
       </w:r>
     </w:p>
     <w:p>
@@ -27910,7 +28359,7 @@
         <w:rPr>
           <w:b/>
         </w:rPr>
-        <w:t>New</w:t>
+        <w:t>Modified</w:t>
       </w:r>
       <w:r>
         <w:t xml:space="preserve"> </w:t>
@@ -27920,744 +28369,30 @@
           <w:rFonts w:ascii="Courier New" w:hAnsi="Courier New"/>
           <w:sz w:val="22"/>
         </w:rPr>
-        <w:t>estimate_optimized_difficulty()</w:t>
-      </w:r>
-      <w:r>
-        <w:t xml:space="preserve"> in </w:t>
+        <w:t>learnflow-backend/app/services/optimal_difficulty.py</w:t>
+      </w:r>
+      <w:r>
+        <w:t xml:space="preserve">'s </w:t>
       </w:r>
       <w:r>
         <w:rPr>
           <w:rFonts w:ascii="Courier New" w:hAnsi="Courier New"/>
           <w:sz w:val="22"/>
         </w:rPr>
-        <w:t>learnflow-backend/app/services/difficulty_fusion.py</w:t>
-      </w:r>
-      <w:r>
-        <w:t xml:space="preserve"> (along with </w:t>
+        <w:t>update_task_difficulty</w:t>
+      </w:r>
+      <w:r>
+        <w:t xml:space="preserve">: replaced the time-consuming </w:t>
       </w:r>
       <w:r>
         <w:rPr>
           <w:rFonts w:ascii="Courier New" w:hAnsi="Courier New"/>
           <w:sz w:val="22"/>
         </w:rPr>
-        <w:t>split_half_reliability()</w:t>
-      </w:r>
-      <w:r>
-        <w:t xml:space="preserve"> and </w:t>
-      </w:r>
-      <w:r>
-        <w:rPr>
-          <w:rFonts w:ascii="Courier New" w:hAnsi="Courier New"/>
-          <w:sz w:val="22"/>
-        </w:rPr>
-        <w:t>OPT_SIGNAL_NAMES</w:t>
-      </w:r>
-      <w:r>
-        <w:t xml:space="preserve">, defined at </w:t>
-      </w:r>
-      <w:r>
-        <w:rPr>
-          <w:rFonts w:ascii="Courier New" w:hAnsi="Courier New"/>
-          <w:sz w:val="22"/>
-        </w:rPr>
-        <w:t>:278</w:t>
-      </w:r>
-      <w:r>
-        <w:t xml:space="preserve">; the file is 338 lines in total): implements the §7.8 </w:t>
-      </w:r>
-      <w:r>
-        <w:rPr>
-          <w:rFonts w:ascii="Courier New" w:hAnsi="Courier New"/>
-          <w:sz w:val="22"/>
-        </w:rPr>
-        <w:t>srw7</w:t>
-      </w:r>
-      <w:r>
-        <w:t xml:space="preserve"> estimator—per-signal sign correction (sign fixed by in-fit-block rank correlation with success-rate direction; inversely signed signals taken negative, not dropped), split-half-reliability weighting (</w:t>
-      </w:r>
-      <w:r>
-        <w:rPr>
-          <w:rFonts w:ascii="Courier New" w:hAnsi="Courier New"/>
-          <w:sz w:val="22"/>
-        </w:rPr>
-        <w:t>split_half_reliability()</w:t>
-      </w:r>
-      <w:r>
-        <w:t xml:space="preserve"> estimates each signal's reliability, taken positive and normalised), and λ-shrinkage (defaults to the closed form </w:t>
-      </w:r>
-      <w:r>
-        <w:rPr>
-          <w:rFonts w:ascii="Courier New" w:hAnsi="Courier New"/>
-          <w:sz w:val="22"/>
-        </w:rPr>
-        <w:t>lambda_closed_form(k)</w:t>
-      </w:r>
-      <w:r>
-        <w:t>). The recommended estimator of §7.4 is this function.</w:t>
-      </w:r>
-    </w:p>
-    <w:p>
-      <w:pPr>
-        <w:ind w:firstLine="360"/>
-        <w:jc w:val="both"/>
-      </w:pPr>
-      <w:r>
-        <w:t xml:space="preserve">The accompanying new </w:t>
-      </w:r>
-      <w:r>
-        <w:rPr>
-          <w:rFonts w:ascii="Courier New" w:hAnsi="Courier New"/>
-          <w:sz w:val="22"/>
-        </w:rPr>
-        <w:t>learnflow-backend/tests/test_difficulty_fusion.py</w:t>
-      </w:r>
-      <w:r>
-        <w:t xml:space="preserve"> (14 regression tests) covers quantile-metric monotone-transform invariance, zero fusion-weight drift, fusion better than single signal, no time jump (difference between 179 s and 181 s &lt; 0.02), and evidence-score boundary [1, 4]; </w:t>
-      </w:r>
-      <w:r>
-        <w:rPr>
-          <w:b/>
-        </w:rPr>
-        <w:t>the above regression tests cover only the first two changes.</w:t>
-      </w:r>
-      <w:r>
-        <w:t xml:space="preserve"> The full test count </w:t>
-      </w:r>
-      <w:r>
-        <w:rPr>
-          <w:b/>
-        </w:rPr>
-        <w:t xml:space="preserve">rose from 920 before the changes to 934 (intermediate) after the difficulty-metric layer added 14 regression tests, then to 936 after this review's remediation added 2 mechanism-count gate tests; measured </w:t>
-      </w:r>
-      <w:r>
-        <w:rPr>
-          <w:rFonts w:ascii="Courier New" w:hAnsi="Courier New"/>
-          <w:b/>
-          <w:sz w:val="22"/>
-        </w:rPr>
-        <w:t>pytest</w:t>
-      </w:r>
-      <w:r>
-        <w:rPr>
-          <w:b/>
-        </w:rPr>
-        <w:t xml:space="preserve"> is now 936 passed</w:t>
-      </w:r>
-      <w:r>
-        <w:t>. All citations in this paper uniformly use 936.</w:t>
-      </w:r>
-    </w:p>
-    <w:p>
-      <w:pPr>
-        <w:ind w:firstLine="360"/>
-        <w:jc w:val="both"/>
-      </w:pPr>
-      <w:r>
-        <w:rPr>
-          <w:b/>
-        </w:rPr>
-        <w:t>Landing method and cost of the third change (stated honestly):</w:t>
-      </w:r>
-      <w:r>
-        <w:t xml:space="preserve"> </w:t>
-      </w:r>
-      <w:r>
-        <w:rPr>
-          <w:rFonts w:ascii="Courier New" w:hAnsi="Courier New"/>
-          <w:sz w:val="22"/>
-        </w:rPr>
-        <w:t>estimate_optimized_difficulty()</w:t>
-      </w:r>
-      <w:r>
-        <w:t xml:space="preserve"> landed as an </w:t>
-      </w:r>
-      <w:r>
-        <w:rPr>
-          <w:b/>
-        </w:rPr>
-        <w:t>incremental function</w:t>
-      </w:r>
-      <w:r>
-        <w:t xml:space="preserve">, </w:t>
-      </w:r>
-      <w:r>
-        <w:rPr>
-          <w:b/>
-        </w:rPr>
-        <w:t>added no new pytest cases</w:t>
-      </w:r>
-      <w:r>
-        <w:t xml:space="preserve">, so </w:t>
-      </w:r>
-      <w:r>
-        <w:rPr>
-          <w:b/>
-        </w:rPr>
-        <w:t>this estimator does not change the test count</w:t>
-      </w:r>
-      <w:r>
-        <w:t xml:space="preserve"> (still 936 full)—the earlier notice "this estimator's landing will change the test count" no longer holds, corrected here honestly.</w:t>
-      </w:r>
-    </w:p>
-    <w:p>
-      <w:pPr>
-        <w:ind w:firstLine="360"/>
-        <w:jc w:val="both"/>
-      </w:pPr>
-      <w:r>
-        <w:t xml:space="preserve">The function's correctness is instead guaranteed by the </w:t>
-      </w:r>
-      <w:r>
-        <w:rPr>
-          <w:b/>
-        </w:rPr>
-        <w:t>external verification script</w:t>
-      </w:r>
-      <w:r>
-        <w:t xml:space="preserve"> </w:t>
-      </w:r>
-      <w:r>
-        <w:rPr>
-          <w:rFonts w:ascii="Courier New" w:hAnsi="Courier New"/>
-          <w:sz w:val="22"/>
-        </w:rPr>
-        <w:t>results/code/o11_land_verify.py</w:t>
-      </w:r>
-      <w:r>
-        <w:t xml:space="preserve">: all 15 checks pass (15/15 PASS), covering module export </w:t>
-      </w:r>
-      <w:r>
-        <w:rPr>
-          <w:rFonts w:ascii="Courier New" w:hAnsi="Courier New"/>
-          <w:sz w:val="22"/>
-        </w:rPr>
-        <w:t>estimate_optimized_difficulty</w:t>
-      </w:r>
-      <w:r>
-        <w:t xml:space="preserve"> / </w:t>
-      </w:r>
-      <w:r>
-        <w:rPr>
-          <w:rFonts w:ascii="Courier New" w:hAnsi="Courier New"/>
-          <w:sz w:val="22"/>
-        </w:rPr>
-        <w:t>split_half_reliability</w:t>
-      </w:r>
-      <w:r>
-        <w:t xml:space="preserve">, </w:t>
-      </w:r>
-      <w:r>
-        <w:rPr>
-          <w:rFonts w:ascii="Courier New" w:hAnsi="Courier New"/>
-          <w:sz w:val="22"/>
-        </w:rPr>
-        <w:t>ValueError</w:t>
-      </w:r>
-      <w:r>
-        <w:t xml:space="preserve"> on k ≤ 0, </w:t>
-      </w:r>
-      <w:r>
-        <w:rPr>
-          <w:rFonts w:ascii="Courier New" w:hAnsi="Courier New"/>
-          <w:sz w:val="22"/>
-        </w:rPr>
-        <w:t>ValueError</w:t>
-      </w:r>
-      <w:r>
-        <w:t xml:space="preserve"> on missing signal, λ default equals </w:t>
-      </w:r>
-      <w:r>
-        <w:rPr>
-          <w:rFonts w:ascii="Courier New" w:hAnsi="Courier New"/>
-          <w:sz w:val="22"/>
-        </w:rPr>
-        <w:t>lambda_closed_form(k)</w:t>
-      </w:r>
-      <w:r>
-        <w:t xml:space="preserve">, </w:t>
-      </w:r>
-      <w:r>
-        <w:rPr>
-          <w:rFonts w:ascii="Courier New" w:hAnsi="Courier New"/>
-          <w:sz w:val="22"/>
-        </w:rPr>
-        <w:t>signed7</w:t>
-      </w:r>
-      <w:r>
-        <w:t xml:space="preserve"> and </w:t>
-      </w:r>
-      <w:r>
-        <w:rPr>
-          <w:rFonts w:ascii="Courier New" w:hAnsi="Courier New"/>
-          <w:sz w:val="22"/>
-        </w:rPr>
-        <w:t>srw7</w:t>
-      </w:r>
-      <w:r>
-        <w:t xml:space="preserve"> holdout gains at k = 10/25/50/100/200 reproduced item-by-item with O11 (e.g., k = 10: +3.594 / +3.823 pp; k = 200: +0.111 / +0.138 pp), and the sign-correction behaviour (after correction fusion positively correlates with difficulty direction, Spearman +0.951).</w:t>
-      </w:r>
-    </w:p>
-    <w:p>
-      <w:pPr>
-        <w:ind w:firstLine="360"/>
-        <w:jc w:val="both"/>
-      </w:pPr>
-      <w:r>
-        <w:rPr>
-          <w:b/>
-        </w:rPr>
-        <w:t>One defect found and fixed by the verifier (stated honestly):</w:t>
-      </w:r>
-      <w:r>
-        <w:t xml:space="preserve"> </w:t>
-      </w:r>
-      <w:r>
-        <w:rPr>
-          <w:rFonts w:ascii="Courier New" w:hAnsi="Courier New"/>
-          <w:sz w:val="22"/>
-        </w:rPr>
-        <w:t>ecdf_logit()</w:t>
-      </w:r>
-      <w:r>
-        <w:t xml:space="preserve"> originally used </w:t>
-      </w:r>
-      <w:r>
-        <w:rPr>
-          <w:rFonts w:ascii="Courier New" w:hAnsi="Courier New"/>
-          <w:sz w:val="22"/>
-        </w:rPr>
-        <w:t>if not values:</w:t>
-      </w:r>
-      <w:r>
-        <w:t xml:space="preserve"> to check emptiness, which raises </w:t>
-      </w:r>
-      <w:r>
-        <w:rPr>
-          <w:rFonts w:ascii="Courier New" w:hAnsi="Courier New"/>
-          <w:sz w:val="22"/>
-        </w:rPr>
-        <w:t>ValueError: The truth value of an array with more than one element is ambiguous</w:t>
-      </w:r>
-      <w:r>
-        <w:t xml:space="preserve"> for numpy array input; now changed to first take </w:t>
-      </w:r>
-      <w:r>
-        <w:rPr>
-          <w:rFonts w:ascii="Courier New" w:hAnsi="Courier New"/>
-          <w:sz w:val="22"/>
-        </w:rPr>
-        <w:t>n = len(values)</w:t>
-      </w:r>
-      <w:r>
-        <w:t xml:space="preserve"> then </w:t>
-      </w:r>
-      <w:r>
-        <w:rPr>
-          <w:rFonts w:ascii="Courier New" w:hAnsi="Courier New"/>
-          <w:sz w:val="22"/>
-        </w:rPr>
-        <w:t>if n == 0: return []</w:t>
-      </w:r>
-      <w:r>
-        <w:t>, behaviour-identical for list input, changing no tested behaviour (</w:t>
-      </w:r>
-      <w:r>
-        <w:rPr>
-          <w:rFonts w:ascii="Courier New" w:hAnsi="Courier New"/>
-          <w:sz w:val="22"/>
-        </w:rPr>
-        <w:t>app/services/difficulty_fusion.py:63</w:t>
-      </w:r>
-      <w:r>
-        <w:t>).</w:t>
-      </w:r>
-    </w:p>
-    <w:p>
-      <w:pPr>
-        <w:pStyle w:val="Heading3"/>
-      </w:pPr>
-      <w:r>
-        <w:rPr>
-          <w:rFonts w:ascii="Times New Roman" w:hAnsi="Times New Roman"/>
-          <w:b/>
-          <w:color w:val="000000"/>
-          <w:sz w:val="24"/>
-        </w:rPr>
-        <w:t>9.3 Limitations</w:t>
-      </w:r>
-    </w:p>
-    <w:p>
-      <w:pPr>
-        <w:ind w:firstLine="360"/>
-        <w:jc w:val="both"/>
-      </w:pPr>
-      <w:r>
-        <w:rPr>
-          <w:b/>
-        </w:rPr>
-        <w:t>First, the causal side is executed but the result is negative.</w:t>
-      </w:r>
-      <w:r>
-        <w:t xml:space="preserve"> §8.3 lists it: the preregistered AIPW/DR was executed under a frozen identification strategy (2026-09-24), detected no internal optimum, μ(d) rises overall with dose, and the Junyi time-inverted negative control is significant—so this paper still contains no causal conclusion about the optimal error rate; all dose–response readings remain at the associational level.</w:t>
-      </w:r>
-    </w:p>
-    <w:p>
-      <w:pPr>
-        <w:ind w:firstLine="360"/>
-        <w:jc w:val="both"/>
-      </w:pPr>
-      <w:r>
-        <w:rPr>
-          <w:b/>
-        </w:rPr>
-        <w:t>Second, the criterion limitation of the fusion gain.</w:t>
-      </w:r>
-      <w:r>
-        <w:t xml:space="preserve"> All conclusions in §7 condition on the two specific criteria "expert difficulty labels" and "holdout performance." The validity gap "O7 splits records not students" was handled by O10's student-level holdout (§7.6)—the conclusion fully reproduces, so it is not a substantive threat. The remaining boundary is the criterion's own reliability ceiling (O7 block B fixed 250, O10 criterion half fixed response count), which limits the absolute level of all ρ; only </w:t>
-      </w:r>
-      <w:r>
-        <w:rPr>
-          <w:b/>
-        </w:rPr>
-        <w:t>within-k between-group comparisons</w:t>
-      </w:r>
-      <w:r>
-        <w:t xml:space="preserve"> are valid.</w:t>
-      </w:r>
-    </w:p>
-    <w:p>
-      <w:pPr>
-        <w:ind w:firstLine="360"/>
-        <w:jc w:val="both"/>
-      </w:pPr>
-      <w:r>
-        <w:rPr>
-          <w:b/>
-        </w:rPr>
-        <w:t>Third, neither λ-shrinkage nor fusion optimisation is cross-system reproduced.</w:t>
-      </w:r>
-      <w:r>
-        <w:t xml:space="preserve"> λ-shrinkage is verified only on Junyi (which has downgrade-rate, repeat-session-rate signals), with no gain on DBE; the O11/O12 optimisation of §7.8 (sign correction + split-half-reliability weighting) is likewise </w:t>
-      </w:r>
-      <w:r>
-        <w:rPr>
-          <w:b/>
-        </w:rPr>
-        <w:t>verified only on Junyi</w:t>
-      </w:r>
-      <w:r>
-        <w:t>, not cross-system reproduced. It must be re-verified before writing it into other systems.</w:t>
-      </w:r>
-    </w:p>
-    <w:p>
-      <w:pPr>
-        <w:ind w:firstLine="360"/>
-        <w:jc w:val="both"/>
-      </w:pPr>
-      <w:r>
-        <w:rPr>
-          <w:b/>
-        </w:rPr>
-        <w:t>Fourth, the suspect status of expert annotation itself.</w:t>
-      </w:r>
-      <w:r>
-        <w:t xml:space="preserve"> This paper uses expert labels as an acceptable criterion, but §7.1 measured their correlation with real-performance difficulty at only 0.4326. This means all comparisons anchored on expert labels (including O2, O4, O5, O6) inherit this limitation. We do not believe a better alternative criterion exists, but we also do not treat expert labels as "truth."</w:t>
-      </w:r>
-    </w:p>
-    <w:p>
-      <w:pPr>
-        <w:ind w:firstLine="360"/>
-        <w:jc w:val="both"/>
-      </w:pPr>
-      <w:r>
-        <w:rPr>
-          <w:b/>
-        </w:rPr>
-        <w:t>Fifth, data-licence constraints.</w:t>
-      </w:r>
-      <w:r>
-        <w:t xml:space="preserve"> Junyi is CC-BY-NC-SA-4.0, </w:t>
-      </w:r>
-      <w:r>
-        <w:rPr>
-          <w:b/>
-        </w:rPr>
-        <w:t>commercial use prohibited</w:t>
-      </w:r>
-      <w:r>
-        <w:t>; all our analyses are offline, non-commercial, read-only research use. Before submission, the citation obligations of all four datasets must be verified item by item (assist09's Feng et al. 2009 and data page, DBE-KT22's arXiv:2208.12651 and ADA DOI, XES3G5M's NeurIPS 2023 and MIT licence, Junyi's Chang et al. 2015 and CC licence).</w:t>
-      </w:r>
-    </w:p>
-    <w:p>
-      <w:pPr>
-        <w:ind w:firstLine="360"/>
-        <w:jc w:val="both"/>
-      </w:pPr>
-      <w:r>
-        <w:rPr>
-          <w:b/>
-        </w:rPr>
-        <w:t>Sixth, the studied system's real deployment data is missing.</w:t>
-      </w:r>
-      <w:r>
-        <w:t xml:space="preserve"> Although the studied system is built and publicly archived, it has no logs produced by real users, so all our measurements rest on the four public datasets; the studied system's role in this paper is a concrete instance of "a class of implementations being criticised" and the carrier of code landing, not an empirical object.</w:t>
-      </w:r>
-    </w:p>
-    <w:p>
-      <w:pPr>
-        <w:ind w:firstLine="360"/>
-        <w:jc w:val="both"/>
-      </w:pPr>
-      <w:r>
-        <w:rPr>
-          <w:b/>
-        </w:rPr>
-        <w:t>Seventh, the learning-addiction-inclination measurement is unvalidated (mandatory disclosure).</w:t>
-      </w:r>
-      <w:r>
-        <w:t xml:space="preserve"> The Learning Addiction Index (LAI) built into the studied system is self-constructed by this project, with five-dimensional weights time 30% / motivation 25% / control 25% / cognitive 10% / function 10%, of which "control + function" totalling 35% is supplied by the self-report measurement layer (instrument catalogue </w:t>
-      </w:r>
-      <w:r>
-        <w:rPr>
-          <w:rFonts w:ascii="Courier New" w:hAnsi="Courier New"/>
-          <w:sz w:val="22"/>
-        </w:rPr>
-        <w:t>instrument_catalog.py</w:t>
-      </w:r>
-      <w:r>
-        <w:t xml:space="preserve">'s SRL-STOP / SLEEP-IMPACT / SOCIAL-IMPACT / TIME-BIAS); dimensions not measured are not counted into the weighting and output </w:t>
-      </w:r>
-      <w:r>
-        <w:rPr>
-          <w:rFonts w:ascii="Courier New" w:hAnsi="Courier New"/>
-          <w:sz w:val="22"/>
-        </w:rPr>
-        <w:t>coverage</w:t>
-      </w:r>
-      <w:r>
-        <w:t xml:space="preserve"> for disclosure, never silently scoring "healthy." </w:t>
-      </w:r>
-      <w:r>
-        <w:rPr>
-          <w:b/>
-        </w:rPr>
-        <w:t>It must be emphasised</w:t>
-      </w:r>
-      <w:r>
-        <w:t xml:space="preserve"> that this scale's items are self-authored by this project, not yet validated for reliability and validity, with no norm and no clinical cutoff, a work-in-progress instrument.</w:t>
-      </w:r>
-    </w:p>
-    <w:p>
-      <w:pPr>
-        <w:ind w:firstLine="360"/>
-        <w:jc w:val="both"/>
-      </w:pPr>
-      <w:r>
-        <w:rPr>
-          <w:b/>
-        </w:rPr>
-        <w:t>This paper did NOT use LAI for any analysis</w:t>
-      </w:r>
-      <w:r>
-        <w:t xml:space="preserve">—all our data come from the four public datasets and contain no self-report scale data; this disclosure only explains the tool's status to prevent readers from assuming the system already has a validated problematic-use measurement capability.The mitigation path is three-pronged and </w:t>
-      </w:r>
-      <w:r>
-        <w:rPr>
-          <w:b/>
-        </w:rPr>
-        <w:t>none completed</w:t>
-      </w:r>
-      <w:r>
-        <w:t>: ① use public validated scales as convergent-validity anchors (BStAS 5 items, Atroszko et al., 2025; SI-10, Loscalzo et al., 2024; Chinese Adolescent Learning Burnout Scale, Wu et al., 2010); ② complete a minimal reliability/validity set (α/ω + EFA→CFA + 2-week retest ICC + correlation with burnout/anxiety); ③ convergent validity between self-report scores and behavioural logs.</w:t>
-      </w:r>
-    </w:p>
-    <w:p>
-      <w:pPr>
-        <w:ind w:firstLine="360"/>
-        <w:jc w:val="both"/>
-      </w:pPr>
-      <w:r>
-        <w:rPr>
-          <w:b/>
-        </w:rPr>
-        <w:t>Eighth (honest negative results as a methodological contribution).</w:t>
-      </w:r>
-      <w:r>
-        <w:t xml:space="preserve"> Reporting "unmet expectations / unexecuted" honestly rather than dressing them up as successes is itself a demonstration of the "preregister–executable–testable" research paradigm, with independent methodological value.</w:t>
-      </w:r>
-    </w:p>
-    <w:p>
-      <w:pPr>
-        <w:ind w:firstLine="360"/>
-        <w:jc w:val="both"/>
-      </w:pPr>
-      <w:r>
-        <w:t xml:space="preserve">Specifically: (a) the causal side executed under a frozen identification strategy yielded a </w:t>
-      </w:r>
-      <w:r>
-        <w:rPr>
-          <w:b/>
-        </w:rPr>
-        <w:t>negative result</w:t>
-      </w:r>
-      <w:r>
-        <w:t xml:space="preserve">—no detected internal optimum in the preregistered sense, and a significant Junyi time-inverted negative control, all dose–response readings downgraded to associational evidence (§8.3), which instead strengthens the separation of "difficulty can be well-definedly fused" from "causal identification of the optimal error rate is not yet supported"; (b) of the seven preregistered hypotheses, </w:t>
-      </w:r>
-      <w:r>
-        <w:rPr>
-          <w:b/>
-        </w:rPr>
-        <w:t>H2 is only partially tested, H3 and H7 unexecuted</w:t>
-      </w:r>
-      <w:r>
-        <w:t xml:space="preserve"> (§8.4), and we do not recast them as supportive conclusions; (c) the </w:t>
-      </w:r>
-      <w:r>
-        <w:rPr>
-          <w:rFonts w:ascii="Courier New" w:hAnsi="Courier New"/>
-          <w:sz w:val="22"/>
-        </w:rPr>
-        <w:t>srw7</w:t>
-      </w:r>
-      <w:r>
-        <w:t xml:space="preserve"> fusion optimisation and direction correction (O8/O11/O12) are </w:t>
-      </w:r>
-      <w:r>
-        <w:rPr>
-          <w:b/>
-        </w:rPr>
-        <w:t>verified only on Junyi, not cross-system reproduced</w:t>
-      </w:r>
-      <w:r>
-        <w:t xml:space="preserve"> (§7.7, 7.8, and 9.3).</w:t>
-      </w:r>
-    </w:p>
-    <w:p>
-      <w:pPr>
-        <w:ind w:firstLine="360"/>
-        <w:jc w:val="both"/>
-      </w:pPr>
-      <w:r>
-        <w:t>These boundaries do not negate this paper's engineering-methodological contributions: the quantile-logit metric's invariant and the criterion dependence of the fusion gain are reproduced on more than two systems; while the above negative results, preregistration gaps, and single-system verification jointly demarcate the method's applicability boundary, which readers should use to calibrate expectations of extrapolation.Accordingly, this paper submits "honest negative results" as one of its contributions, consistent with the reception orientation of the target journals (IEEE TLT / IJAIED / JEDM) toward methodological and reproducibility research.</w:t>
-      </w:r>
-    </w:p>
-    <w:p>
-      <w:pPr>
-        <w:ind w:firstLine="360"/>
-        <w:jc w:val="both"/>
-      </w:pPr>
-      <w:r>
-        <w:rPr>
-          <w:b/>
-        </w:rPr>
-        <w:t>Ninth (scope of the methodological contribution: cross-system gain pending).</w:t>
-      </w:r>
-      <w:r>
-        <w:t xml:space="preserve"> The engineering-methodological contribution must be clearly separated from "cross-system gain." §7 already shows: on DBE-KT22 the fusion gain is only marginally significant (one-sided p = 0.059) and negative after criterion switch, and Junyi is the only system so far that reproduces and verifies the fusion gain; </w:t>
-      </w:r>
-      <w:r>
-        <w:rPr>
-          <w:rFonts w:ascii="Courier New" w:hAnsi="Courier New"/>
-          <w:sz w:val="22"/>
-        </w:rPr>
-        <w:t>srw7</w:t>
-      </w:r>
-      <w:r>
-        <w:t xml:space="preserve"> (sign correction + split-half-reliability weighting) and the §7.3 direction-error correction are </w:t>
-      </w:r>
-      <w:r>
-        <w:rPr>
-          <w:b/>
-        </w:rPr>
-        <w:t>verified methods</w:t>
-      </w:r>
-      <w:r>
-        <w:t xml:space="preserve">, but their </w:t>
-      </w:r>
-      <w:r>
-        <w:rPr>
-          <w:b/>
-        </w:rPr>
-        <w:t>cross-system gain remains to be proven (cross-system gain pending)</w:t>
-      </w:r>
-      <w:r>
-        <w:t xml:space="preserve">. Therefore this paper's contribution positioning is "method + single-system (Junyi) verification + honest boundary on cross-system extrapolation," not an already-proven cross-system improvement; readers must re-verify on their own system's data before writing </w:t>
-      </w:r>
-      <w:r>
-        <w:rPr>
-          <w:rFonts w:ascii="Courier New" w:hAnsi="Courier New"/>
-          <w:sz w:val="22"/>
-        </w:rPr>
-        <w:t>srw7</w:t>
-      </w:r>
-      <w:r>
-        <w:t xml:space="preserve"> into other systems.</w:t>
-      </w:r>
-    </w:p>
-    <w:p>
-      <w:pPr>
-        <w:pStyle w:val="Heading3"/>
-      </w:pPr>
-      <w:r>
-        <w:rPr>
-          <w:rFonts w:ascii="Times New Roman" w:hAnsi="Times New Roman"/>
-          <w:b/>
-          <w:color w:val="000000"/>
-          <w:sz w:val="24"/>
-        </w:rPr>
-        <w:t>9.4 One practical recommendation</w:t>
-      </w:r>
-    </w:p>
-    <w:p>
-      <w:pPr>
-        <w:ind w:firstLine="360"/>
-        <w:jc w:val="both"/>
-      </w:pPr>
-      <w:r>
-        <w:t xml:space="preserve">Synthesising §5.3, §7.3, §7.7, and §7.8, this paper's practical recommendation for the difficulty-fusion module is one sentence: </w:t>
-      </w:r>
-      <w:r>
-        <w:rPr>
-          <w:b/>
-        </w:rPr>
-        <w:t>first switch the metric to quantile logit (unconditional), then decide whether to enable multi-signal fusion by sample size (conditional), and before enabling, do direction correction per signal rather than simple deletion (mandatory).</w:t>
-      </w:r>
-      <w:r>
-        <w:t xml:space="preserve"> The first item's gain is largest and depends on no tuning; the second item's gain approaches zero when observations per item ≥100; the third is a </w:t>
-      </w:r>
-      <w:r>
-        <w:rPr>
-          <w:b/>
-        </w:rPr>
-        <w:t>directional-configuration error</w:t>
-      </w:r>
-      <w:r>
-        <w:t xml:space="preserve">—§7.8 shows that deleting a directionally wrong signal column-wise (O8's fused6) discards its effective information, while correcting its direction (counting it as negative evidence) is instead superior, i.e., </w:t>
-      </w:r>
-      <w:r>
-        <w:rPr>
-          <w:b/>
-        </w:rPr>
-        <w:t>correction beats deletion</w:t>
-      </w:r>
-      <w:r>
-        <w:t>.</w:t>
-      </w:r>
-    </w:p>
-    <w:p>
-      <w:bookmarkStart w:id="9" w:name="section-10"/>
-      <w:pPr>
-        <w:pStyle w:val="Heading2"/>
-      </w:pPr>
-      <w:bookmarkEnd w:id="9"/>
-      <w:r>
-        <w:rPr>
-          <w:rFonts w:ascii="Times New Roman" w:hAnsi="Times New Roman"/>
-          <w:b/>
-          <w:color w:val="000000"/>
-          <w:sz w:val="28"/>
-        </w:rPr>
-        <w:t>10 Honest Gap Inventory</w:t>
+        <w:t>&gt;180s</w:t>
+      </w:r>
+      <w:r>
+        <w:t xml:space="preserve"> hard-threshold bracketing with a log-time continuous monotonic soft term s = σ(ln(t/60)/0.8), and added a hint penalty (O5 shows hint rate is an effective difficulty signal); the old behaviour contract "lower difficulty after fast correct" is preserved.</w:t>
       </w:r>
     </w:p>
     <w:p>
@@ -28674,245 +28409,90 @@
         <w:rPr>
           <w:b/>
         </w:rPr>
-        <w:t>Causal side executed, result negative (2026-09-24):</w:t>
-      </w:r>
-      <w:r>
-        <w:t xml:space="preserve"> the preregistered AIPW/DR, dose–response estimation, and negative control were executed under a frozen identification strategy (§8.3); result is no detected internal optimum, significant Junyi negative control (downgraded to associational evidence). Still unexecuted: E-value, the formal ordering test of the five premises, the P-pos-2 simulation-arm control.</w:t>
-      </w:r>
-    </w:p>
-    <w:p>
-      <w:pPr>
-        <w:pStyle w:val="ListNumber"/>
-        <w:numPr>
-          <w:ilvl w:val="0"/>
-          <w:numId w:val="13"/>
-        </w:numPr>
-        <w:spacing w:after="120"/>
-        <w:jc w:val="both"/>
-      </w:pPr>
-      <w:r>
-        <w:rPr>
-          <w:b/>
-        </w:rPr>
-        <w:t>H2 / H3 not executed per original caliber:</w:t>
-      </w:r>
-      <w:r>
-        <w:t xml:space="preserve"> ECE, Brier, reliability diagram, and 85% target-hit rate not computed; four-source calibration-error ordering not tested (§8.4).</w:t>
-      </w:r>
-    </w:p>
-    <w:p>
-      <w:pPr>
-        <w:pStyle w:val="ListNumber"/>
-        <w:numPr>
-          <w:ilvl w:val="0"/>
-          <w:numId w:val="13"/>
-        </w:numPr>
-        <w:spacing w:after="120"/>
-        <w:jc w:val="both"/>
-      </w:pPr>
-      <w:r>
-        <w:rPr>
-          <w:b/>
-        </w:rPr>
-        <w:t>The record-level-holdout validity gap was handled by O10's student-level holdout</w:t>
-      </w:r>
-      <w:r>
-        <w:t xml:space="preserve"> (§7.6): conclusion fully reproduces, the "record-level rather than student-level" concern is tested to have little effect. Remaining boundary: gain decays to ≤0.34 pp for k ≥ 100 (student-level </w:t>
+        <w:t>New</w:t>
+      </w:r>
+      <w:r>
+        <w:t xml:space="preserve"> </w:t>
       </w:r>
       <w:r>
         <w:rPr>
           <w:rFonts w:ascii="Courier New" w:hAnsi="Courier New"/>
           <w:sz w:val="22"/>
         </w:rPr>
-        <w:t>srw7</w:t>
-      </w:r>
-      <w:r>
-        <w:t xml:space="preserve"> caliber: k = 100 is +0.335 pp, k = 200 is +0.102 pp; record-level +0.391 / +0.138 pp) and λ-shrinkage not reproduced on DBE (§7.7).</w:t>
-      </w:r>
-    </w:p>
-    <w:p>
-      <w:pPr>
-        <w:pStyle w:val="ListNumber"/>
-        <w:numPr>
-          <w:ilvl w:val="0"/>
-          <w:numId w:val="13"/>
-        </w:numPr>
-        <w:spacing w:after="120"/>
-        <w:jc w:val="both"/>
-      </w:pPr>
-      <w:r>
-        <w:rPr>
-          <w:b/>
-        </w:rPr>
-        <w:t>λ-shrinkage not reproduced on DBE</w:t>
-      </w:r>
-      <w:r>
-        <w:t xml:space="preserve"> (§7.5).</w:t>
-      </w:r>
-    </w:p>
-    <w:p>
-      <w:pPr>
-        <w:pStyle w:val="ListNumber"/>
-        <w:numPr>
-          <w:ilvl w:val="0"/>
-          <w:numId w:val="13"/>
-        </w:numPr>
-        <w:spacing w:after="120"/>
-        <w:jc w:val="both"/>
-      </w:pPr>
-      <w:r>
-        <w:rPr>
-          <w:b/>
-        </w:rPr>
-        <w:t>O11/O12 optimisation not cross-system reproduced:</w:t>
-      </w:r>
-      <w:r>
-        <w:t xml:space="preserve"> the recommended estimator </w:t>
+        <w:t>estimate_optimized_difficulty()</w:t>
+      </w:r>
+      <w:r>
+        <w:t xml:space="preserve"> in </w:t>
       </w:r>
       <w:r>
         <w:rPr>
           <w:rFonts w:ascii="Courier New" w:hAnsi="Courier New"/>
           <w:sz w:val="22"/>
         </w:rPr>
-        <w:t>estimate_optimized_difficulty</w:t>
-      </w:r>
-      <w:r>
-        <w:t xml:space="preserve"> (sign correction + split-half-reliability weighting + λ-shrinkage) has been </w:t>
-      </w:r>
-      <w:r>
-        <w:rPr>
-          <w:b/>
-        </w:rPr>
-        <w:t>incrementally landed</w:t>
-      </w:r>
-      <w:r>
-        <w:t xml:space="preserve"> to the repo code (this landing does not change the test count, currently 936 full), its correctness guaranteed by the external verification script </w:t>
+        <w:t>learnflow-backend/app/services/difficulty_fusion.py</w:t>
+      </w:r>
+      <w:r>
+        <w:t xml:space="preserve"> (along with </w:t>
       </w:r>
       <w:r>
         <w:rPr>
           <w:rFonts w:ascii="Courier New" w:hAnsi="Courier New"/>
           <w:sz w:val="22"/>
         </w:rPr>
-        <w:t>results/code/o11_land_verify.py</w:t>
-      </w:r>
-      <w:r>
-        <w:t xml:space="preserve"> (15/15 PASS) (§9.2); but this optimisation is verified only on Junyi, not cross-system reproduced (§9.3).</w:t>
-      </w:r>
-    </w:p>
-    <w:p>
-      <w:pPr>
-        <w:pStyle w:val="ListNumber"/>
-        <w:numPr>
-          <w:ilvl w:val="0"/>
-          <w:numId w:val="13"/>
-        </w:numPr>
-        <w:spacing w:after="120"/>
-        <w:jc w:val="both"/>
-      </w:pPr>
-      <w:r>
-        <w:rPr>
-          <w:b/>
-        </w:rPr>
-        <w:t>Expert-label-criterion reliability not independently estimated:</w:t>
-      </w:r>
-      <w:r>
-        <w:t xml:space="preserve"> this paper obtained no inter-rater reliability of the expert annotation; all uncertainty of the 0.4326 distance is attributed to the single realisation of the expert labels.</w:t>
-      </w:r>
-    </w:p>
-    <w:p>
-      <w:pPr>
-        <w:pStyle w:val="ListNumber"/>
-        <w:numPr>
-          <w:ilvl w:val="0"/>
-          <w:numId w:val="13"/>
-        </w:numPr>
-        <w:spacing w:after="120"/>
-        <w:jc w:val="both"/>
-      </w:pPr>
-      <w:r>
-        <w:rPr>
-          <w:b/>
-        </w:rPr>
-        <w:t>assist09 sliding-window analysis uses the "one row per student-problem" revised version;</w:t>
-      </w:r>
-      <w:r>
-        <w:t xml:space="preserve"> help-recording semantics (tutor semantics) handled per the official caliber, possibly differing from some secondary literature.</w:t>
-      </w:r>
-    </w:p>
-    <w:p>
-      <w:pPr>
-        <w:pStyle w:val="ListNumber"/>
-        <w:numPr>
-          <w:ilvl w:val="0"/>
-          <w:numId w:val="13"/>
-        </w:numPr>
-        <w:spacing w:after="120"/>
-        <w:jc w:val="both"/>
-      </w:pPr>
-      <w:r>
-        <w:rPr>
-          <w:b/>
-        </w:rPr>
-        <w:t>The synthetic experiment's most-favourable environment:</w:t>
-      </w:r>
-      <w:r>
-        <w:t xml:space="preserve"> the four sources sharing one latent variable is the most favourable setting for the proposition to hold (§4.6).</w:t>
-      </w:r>
-    </w:p>
-    <w:p>
-      <w:pPr>
-        <w:pStyle w:val="ListNumber"/>
-        <w:numPr>
-          <w:ilvl w:val="0"/>
-          <w:numId w:val="13"/>
-        </w:numPr>
-        <w:spacing w:after="120"/>
-        <w:jc w:val="both"/>
-      </w:pPr>
-      <w:r>
-        <w:rPr>
-          <w:b/>
-        </w:rPr>
-        <w:t>Data licences not legally verified item by item:</w:t>
-      </w:r>
-      <w:r>
-        <w:t xml:space="preserve"> the citation obligations and commercial restrictions of the four datasets follow official pages and must be closed before submission.</w:t>
-      </w:r>
-    </w:p>
-    <w:p>
-      <w:pPr>
-        <w:pStyle w:val="ListNumber"/>
-        <w:numPr>
-          <w:ilvl w:val="0"/>
-          <w:numId w:val="13"/>
-        </w:numPr>
-        <w:spacing w:after="120"/>
-        <w:jc w:val="both"/>
-      </w:pPr>
-      <w:r>
-        <w:rPr>
-          <w:b/>
-        </w:rPr>
-        <w:t>LAI unvalidated and not used in this paper</w:t>
-      </w:r>
-      <w:r>
-        <w:t xml:space="preserve"> (§9.3 seventh point); all three mitigation paths unfinished.</w:t>
-      </w:r>
-    </w:p>
-    <w:p>
-      <w:bookmarkStart w:id="10" w:name="section-11"/>
-      <w:pPr>
-        <w:pStyle w:val="Heading2"/>
-      </w:pPr>
-      <w:bookmarkEnd w:id="10"/>
-      <w:r>
-        <w:rPr>
-          <w:rFonts w:ascii="Times New Roman" w:hAnsi="Times New Roman"/>
-          <w:b/>
-          <w:color w:val="000000"/>
-          <w:sz w:val="28"/>
-        </w:rPr>
-        <w:t>11 Conclusions</w:t>
+        <w:t>split_half_reliability()</w:t>
+      </w:r>
+      <w:r>
+        <w:t xml:space="preserve"> and </w:t>
+      </w:r>
+      <w:r>
+        <w:rPr>
+          <w:rFonts w:ascii="Courier New" w:hAnsi="Courier New"/>
+          <w:sz w:val="22"/>
+        </w:rPr>
+        <w:t>OPT_SIGNAL_NAMES</w:t>
+      </w:r>
+      <w:r>
+        <w:t xml:space="preserve">, defined at </w:t>
+      </w:r>
+      <w:r>
+        <w:rPr>
+          <w:rFonts w:ascii="Courier New" w:hAnsi="Courier New"/>
+          <w:sz w:val="22"/>
+        </w:rPr>
+        <w:t>:278</w:t>
+      </w:r>
+      <w:r>
+        <w:t xml:space="preserve">; the file is 338 lines in total): implements the §7.8 </w:t>
+      </w:r>
+      <w:r>
+        <w:rPr>
+          <w:rFonts w:ascii="Courier New" w:hAnsi="Courier New"/>
+          <w:sz w:val="22"/>
+        </w:rPr>
+        <w:t>srw7</w:t>
+      </w:r>
+      <w:r>
+        <w:t xml:space="preserve"> estimator—per-signal sign correction (sign fixed by in-fit-block rank correlation with success-rate direction; inversely signed signals taken negative, not dropped), split-half-reliability weighting (</w:t>
+      </w:r>
+      <w:r>
+        <w:rPr>
+          <w:rFonts w:ascii="Courier New" w:hAnsi="Courier New"/>
+          <w:sz w:val="22"/>
+        </w:rPr>
+        <w:t>split_half_reliability()</w:t>
+      </w:r>
+      <w:r>
+        <w:t xml:space="preserve"> estimates each signal's reliability, taken positive and normalised), and λ-shrinkage (defaults to the closed form </w:t>
+      </w:r>
+      <w:r>
+        <w:rPr>
+          <w:rFonts w:ascii="Courier New" w:hAnsi="Courier New"/>
+          <w:sz w:val="22"/>
+        </w:rPr>
+        <w:t>lambda_closed_form(k)</w:t>
+      </w:r>
+      <w:r>
+        <w:t>). The recommended estimator of §7.4 is this function.</w:t>
       </w:r>
     </w:p>
     <w:p>
@@ -28921,34 +28501,49 @@
         <w:jc w:val="both"/>
       </w:pPr>
       <w:r>
-        <w:t>This paper rewrote the question "can difficulty be measured on one common scale," which engineering practice had skipped, into a falsifiable measurement proposition, and gave results on synthetic data and four public learning-log corpora.</w:t>
+        <w:t xml:space="preserve">The accompanying new </w:t>
+      </w:r>
+      <w:r>
+        <w:rPr>
+          <w:rFonts w:ascii="Courier New" w:hAnsi="Courier New"/>
+          <w:sz w:val="22"/>
+        </w:rPr>
+        <w:t>learnflow-backend/tests/test_difficulty_fusion.py</w:t>
+      </w:r>
+      <w:r>
+        <w:t xml:space="preserve"> (14 regression tests) covers quantile-metric monotone-transform invariance, zero fusion-weight drift, fusion better than single signal, no time jump (difference between 179 s and 181 s &lt; 0.02), and evidence-score boundary [1, 4]; </w:t>
       </w:r>
       <w:r>
         <w:rPr>
           <w:b/>
         </w:rPr>
-        <w:t>The caliber must be stated first:</w:t>
-      </w:r>
-      <w:r>
-        <w:t xml:space="preserve"> the </w:t>
+        <w:t>the above regression tests cover only the first two changes.</w:t>
+      </w:r>
+      <w:r>
+        <w:t xml:space="preserve"> The full test count </w:t>
       </w:r>
       <w:r>
         <w:rPr>
           <w:b/>
         </w:rPr>
-        <w:t>real-data test of proposition C1 was completed at only one real system, assist09</w:t>
-      </w:r>
-      <w:r>
-        <w:t xml:space="preserve"> (994 items); the Junyi, DBE-KT22, and XES3G5M datasets bear the multi-signal-fusion consistency experiment, the expert-annotation experiment, and the knowledge-tree / ordered-transition experiment, and </w:t>
-      </w:r>
-      <w:r>
-        <w:rPr>
+        <w:t xml:space="preserve">rose from 920 before the changes to 934 (intermediate) after the difficulty-metric layer added 14 regression tests, then to 936 after this review's remediation added 2 mechanism-count gate tests; measured </w:t>
+      </w:r>
+      <w:r>
+        <w:rPr>
+          <w:rFonts w:ascii="Courier New" w:hAnsi="Courier New"/>
           <w:b/>
-        </w:rPr>
-        <w:t>do not constitute a test of C1</w:t>
-      </w:r>
-      <w:r>
-        <w:t xml:space="preserve"> (see the title-caliber note at the front).The instability proposition holds: linear [0,1] fusion's effective weights equal neither the nominal weights (π₁ = 0.532 vs.</w:t>
+          <w:sz w:val="22"/>
+        </w:rPr>
+        <w:t>pytest</w:t>
+      </w:r>
+      <w:r>
+        <w:rPr>
+          <w:b/>
+        </w:rPr>
+        <w:t xml:space="preserve"> is now 936 passed</w:t>
+      </w:r>
+      <w:r>
+        <w:t>. All citations in this paper uniformly use 936.</w:t>
       </w:r>
     </w:p>
     <w:p>
@@ -28957,7 +28552,50 @@
         <w:jc w:val="both"/>
       </w:pPr>
       <w:r>
-        <w:t>w₁ = 0.40) nor themselves under monotone reparameterisation (nonlinear monotone L1 = 0.1276, 36.4% cell rank reversal, strongest counterexample complete sign reversal), while the quantile-logit metric is strictly invariant to it (0 under shared calibration, 0.016 sampling noise under independent calibration); on assist09's 994 items, the real drift falls from 0.5357 to 0.0001.</w:t>
+        <w:rPr>
+          <w:b/>
+        </w:rPr>
+        <w:t>Landing method and cost of the third change (stated honestly):</w:t>
+      </w:r>
+      <w:r>
+        <w:t xml:space="preserve"> </w:t>
+      </w:r>
+      <w:r>
+        <w:rPr>
+          <w:rFonts w:ascii="Courier New" w:hAnsi="Courier New"/>
+          <w:sz w:val="22"/>
+        </w:rPr>
+        <w:t>estimate_optimized_difficulty()</w:t>
+      </w:r>
+      <w:r>
+        <w:t xml:space="preserve"> landed as an </w:t>
+      </w:r>
+      <w:r>
+        <w:rPr>
+          <w:b/>
+        </w:rPr>
+        <w:t>incremental function</w:t>
+      </w:r>
+      <w:r>
+        <w:t xml:space="preserve">, </w:t>
+      </w:r>
+      <w:r>
+        <w:rPr>
+          <w:b/>
+        </w:rPr>
+        <w:t>added no new pytest cases</w:t>
+      </w:r>
+      <w:r>
+        <w:t xml:space="preserve">, so </w:t>
+      </w:r>
+      <w:r>
+        <w:rPr>
+          <w:b/>
+        </w:rPr>
+        <w:t>this estimator does not change the test count</w:t>
+      </w:r>
+      <w:r>
+        <w:t xml:space="preserve"> (still 936 full)—the earlier notice "this estimator's landing will change the test count" no longer holds, corrected here honestly.</w:t>
       </w:r>
     </w:p>
     <w:p>
@@ -28966,7 +28604,96 @@
         <w:jc w:val="both"/>
       </w:pPr>
       <w:r>
-        <w:t>Multi-signal fusion does raise consistency with expert difficulty labels (DBE 0.2207 → 0.2899, repeated-cross-validation optimised weights 0.5240 ± 0.1069; Junyi 0.2610 → 0.3629, repeated cross-validation 0.4023 ± 0.0480), driven by a "self-reported difficulty high and trust low" differential feature; but the rank correlation between expert labels and real-performance difficulty is only 0.4326, and after switching the criterion to holdout performance, fusion is worse than success rate alone at every sample size on both datasets, with win rate 0.00—these gains are consistency gains, not predictive-power improvement.We further located a directional error in the fusion configuration and proposed sample-size-adaptive shrinkage, whose gain reaches +3.43 percentage points at k = 10 (O8 caliber) and decays below 0.22 percentage points for k ≥ 100, and is not reproduced on DBE.</w:t>
+        <w:t xml:space="preserve">The function's correctness is instead guaranteed by the </w:t>
+      </w:r>
+      <w:r>
+        <w:rPr>
+          <w:b/>
+        </w:rPr>
+        <w:t>external verification script</w:t>
+      </w:r>
+      <w:r>
+        <w:t xml:space="preserve"> </w:t>
+      </w:r>
+      <w:r>
+        <w:rPr>
+          <w:rFonts w:ascii="Courier New" w:hAnsi="Courier New"/>
+          <w:sz w:val="22"/>
+        </w:rPr>
+        <w:t>results/code/o11_land_verify.py</w:t>
+      </w:r>
+      <w:r>
+        <w:t xml:space="preserve">: all 15 checks pass (15/15 PASS), covering module export </w:t>
+      </w:r>
+      <w:r>
+        <w:rPr>
+          <w:rFonts w:ascii="Courier New" w:hAnsi="Courier New"/>
+          <w:sz w:val="22"/>
+        </w:rPr>
+        <w:t>estimate_optimized_difficulty</w:t>
+      </w:r>
+      <w:r>
+        <w:t xml:space="preserve"> / </w:t>
+      </w:r>
+      <w:r>
+        <w:rPr>
+          <w:rFonts w:ascii="Courier New" w:hAnsi="Courier New"/>
+          <w:sz w:val="22"/>
+        </w:rPr>
+        <w:t>split_half_reliability</w:t>
+      </w:r>
+      <w:r>
+        <w:t xml:space="preserve">, </w:t>
+      </w:r>
+      <w:r>
+        <w:rPr>
+          <w:rFonts w:ascii="Courier New" w:hAnsi="Courier New"/>
+          <w:sz w:val="22"/>
+        </w:rPr>
+        <w:t>ValueError</w:t>
+      </w:r>
+      <w:r>
+        <w:t xml:space="preserve"> on k ≤ 0, </w:t>
+      </w:r>
+      <w:r>
+        <w:rPr>
+          <w:rFonts w:ascii="Courier New" w:hAnsi="Courier New"/>
+          <w:sz w:val="22"/>
+        </w:rPr>
+        <w:t>ValueError</w:t>
+      </w:r>
+      <w:r>
+        <w:t xml:space="preserve"> on missing signal, λ default equals </w:t>
+      </w:r>
+      <w:r>
+        <w:rPr>
+          <w:rFonts w:ascii="Courier New" w:hAnsi="Courier New"/>
+          <w:sz w:val="22"/>
+        </w:rPr>
+        <w:t>lambda_closed_form(k)</w:t>
+      </w:r>
+      <w:r>
+        <w:t xml:space="preserve">, </w:t>
+      </w:r>
+      <w:r>
+        <w:rPr>
+          <w:rFonts w:ascii="Courier New" w:hAnsi="Courier New"/>
+          <w:sz w:val="22"/>
+        </w:rPr>
+        <w:t>signed7</w:t>
+      </w:r>
+      <w:r>
+        <w:t xml:space="preserve"> and </w:t>
+      </w:r>
+      <w:r>
+        <w:rPr>
+          <w:rFonts w:ascii="Courier New" w:hAnsi="Courier New"/>
+          <w:sz w:val="22"/>
+        </w:rPr>
+        <w:t>srw7</w:t>
+      </w:r>
+      <w:r>
+        <w:t xml:space="preserve"> holdout gains at k = 10/25/50/100/200 reproduced item-by-item with O11 (e.g., k = 10: +3.594 / +3.823 pp; k = 200: +0.111 / +0.138 pp), and the sign-correction behaviour (after correction fusion positively correlates with difficulty direction, Spearman +0.951).</w:t>
       </w:r>
     </w:p>
     <w:p>
@@ -28975,17 +28702,87 @@
         <w:jc w:val="both"/>
       </w:pPr>
       <w:r>
-        <w:t xml:space="preserve">Further optimisation of the fusion estimator itself (sign correction + split-half-reliability weighting, </w:t>
+        <w:rPr>
+          <w:b/>
+        </w:rPr>
+        <w:t>One defect found and fixed by the verifier (stated honestly):</w:t>
+      </w:r>
+      <w:r>
+        <w:t xml:space="preserve"> </w:t>
       </w:r>
       <w:r>
         <w:rPr>
           <w:rFonts w:ascii="Courier New" w:hAnsi="Courier New"/>
           <w:sz w:val="22"/>
         </w:rPr>
-        <w:t>srw7</w:t>
-      </w:r>
-      <w:r>
-        <w:t>) was doubly validated at record-level and student-level holdout: non-inferior to success-rate-only at every sample size, and consistently better than fused6 which only deletes.</w:t>
+        <w:t>ecdf_logit()</w:t>
+      </w:r>
+      <w:r>
+        <w:t xml:space="preserve"> originally used </w:t>
+      </w:r>
+      <w:r>
+        <w:rPr>
+          <w:rFonts w:ascii="Courier New" w:hAnsi="Courier New"/>
+          <w:sz w:val="22"/>
+        </w:rPr>
+        <w:t>if not values:</w:t>
+      </w:r>
+      <w:r>
+        <w:t xml:space="preserve"> to check emptiness, which raises </w:t>
+      </w:r>
+      <w:r>
+        <w:rPr>
+          <w:rFonts w:ascii="Courier New" w:hAnsi="Courier New"/>
+          <w:sz w:val="22"/>
+        </w:rPr>
+        <w:t>ValueError: The truth value of an array with more than one element is ambiguous</w:t>
+      </w:r>
+      <w:r>
+        <w:t xml:space="preserve"> for numpy array input; now changed to first take </w:t>
+      </w:r>
+      <w:r>
+        <w:rPr>
+          <w:rFonts w:ascii="Courier New" w:hAnsi="Courier New"/>
+          <w:sz w:val="22"/>
+        </w:rPr>
+        <w:t>n = len(values)</w:t>
+      </w:r>
+      <w:r>
+        <w:t xml:space="preserve"> then </w:t>
+      </w:r>
+      <w:r>
+        <w:rPr>
+          <w:rFonts w:ascii="Courier New" w:hAnsi="Courier New"/>
+          <w:sz w:val="22"/>
+        </w:rPr>
+        <w:t>if n == 0: return []</w:t>
+      </w:r>
+      <w:r>
+        <w:t>, behaviour-identical for list input, changing no tested behaviour (</w:t>
+      </w:r>
+      <w:r>
+        <w:rPr>
+          <w:rFonts w:ascii="Courier New" w:hAnsi="Courier New"/>
+          <w:sz w:val="22"/>
+        </w:rPr>
+        <w:t>app/services/difficulty_fusion.py:63</w:t>
+      </w:r>
+      <w:r>
+        <w:t>).</w:t>
+      </w:r>
+    </w:p>
+    <w:p>
+      <w:pPr>
+        <w:pStyle w:val="Heading3"/>
+      </w:pPr>
+      <w:r>
+        <w:rPr>
+          <w:rFonts w:ascii="Times New Roman" w:hAnsi="Times New Roman"/>
+          <w:b/>
+          <w:color w:val="000000"/>
+          <w:sz w:val="24"/>
+        </w:rPr>
+        <w:t>9.3 Limitations</w:t>
       </w:r>
     </w:p>
     <w:p>
@@ -28994,34 +28791,13 @@
         <w:jc w:val="both"/>
       </w:pPr>
       <w:r>
-        <w:t xml:space="preserve">Finally, this paper reports that the single-value mode of the assist09 sliding-window error-rate distribution is </w:t>
-      </w:r>
-      <w:r>
         <w:rPr>
           <w:b/>
         </w:rPr>
-        <w:t>error rate 0.25 (success rate 75%)</w:t>
-      </w:r>
-      <w:r>
-        <w:t xml:space="preserve"> (n = 286,150 windows; 21 discrete support points; the 80–85% success band occupies only 19.64%), and explicitly states that this descriptive evidence </w:t>
-      </w:r>
-      <w:r>
-        <w:rPr>
-          <w:b/>
-        </w:rPr>
-        <w:t>supports neither the 85% rule nor 80.7%, and the earlier-reported "mode interval 0.15–0.20" was verified to be a binning-boundary artifact of equal-width binning and is voided</w:t>
-      </w:r>
-      <w:r>
-        <w:t xml:space="preserve">; </w:t>
-      </w:r>
-      <w:r>
-        <w:rPr>
-          <w:b/>
-        </w:rPr>
-        <w:t>the preregistered dose–response identification was fully executed on 2026-09-24 under a frozen identification strategy (LF-CIS-2026-09-22), yielding "no internal optimum in the preregistered sense detected," and Junyi's time-inverted negative control is significant</w:t>
-      </w:r>
-      <w:r>
-        <w:t xml:space="preserve"> (low-end exceedance 1.000/0.998), so per that strategy's §6.2 handling convention all dose–response conclusions are downgraded to associational evi</w:t>
+        <w:t>First, the causal side is executed but the result is negative.</w:t>
+      </w:r>
+      <w:r>
+        <w:t xml:space="preserve"> §8.3 lists it: the preregistered AIPW/DR was executed under a frozen identification strategy (2026-09-24), detected no internal optimum, μ(d) rises overall with dose, and the Junyi time-inverted negative control is significant—so this paper still contains no causal conclusion about the optimal error rate; all dose–response readings remain at the associational level.</w:t>
       </w:r>
     </w:p>
     <w:p>
@@ -29030,16 +28806,22 @@
         <w:jc w:val="both"/>
       </w:pPr>
       <w:r>
-        <w:t xml:space="preserve">dence; therefore this paper </w:t>
-      </w:r>
-      <w:r>
         <w:rPr>
           <w:b/>
         </w:rPr>
-        <w:t>still makes no point estimate, confidence interval, or test against 15.87% for the optimal error rate</w:t>
-      </w:r>
-      <w:r>
-        <w:t xml:space="preserve"> (that test presupposes the existence of an internal optimum, a premise not supported), and makes no directional assertion about whether that value holds for real learners (full execution record in §8.3; the conclusion section's earlier wording "causal side not executed" was legacy from an old version and was corrected on 2026-09-25).</w:t>
+        <w:t>Second, the criterion limitation of the fusion gain.</w:t>
+      </w:r>
+      <w:r>
+        <w:t xml:space="preserve"> All conclusions in §7 condition on the two specific criteria "expert difficulty labels" and "holdout performance." The validity gap "O7 splits records not students" was handled by O10's student-level holdout (§7.6)—the conclusion fully reproduces, so it is not a substantive threat. The remaining boundary is the criterion's own reliability ceiling (O7 block B fixed 250, O10 criterion half fixed response count), which limits the absolute level of all ρ; only </w:t>
+      </w:r>
+      <w:r>
+        <w:rPr>
+          <w:b/>
+        </w:rPr>
+        <w:t>within-k between-group comparisons</w:t>
+      </w:r>
+      <w:r>
+        <w:t xml:space="preserve"> are valid.</w:t>
       </w:r>
     </w:p>
     <w:p>
@@ -29048,62 +28830,22 @@
         <w:jc w:val="both"/>
       </w:pPr>
       <w:r>
-        <w:t xml:space="preserve">The three conclusions have partially landed in the studied system's difficulty-metric layer (full test 936 passed); the </w:t>
-      </w:r>
-      <w:r>
-        <w:rPr>
-          <w:rFonts w:ascii="Courier New" w:hAnsi="Courier New"/>
-          <w:sz w:val="22"/>
-        </w:rPr>
-        <w:t>srw7</w:t>
-      </w:r>
-      <w:r>
-        <w:t xml:space="preserve"> estimator has also landed as the incremental function </w:t>
-      </w:r>
-      <w:r>
-        <w:rPr>
-          <w:rFonts w:ascii="Courier New" w:hAnsi="Courier New"/>
-          <w:sz w:val="22"/>
-        </w:rPr>
-        <w:t>estimate_optimized_difficulty()</w:t>
-      </w:r>
-      <w:r>
-        <w:t xml:space="preserve"> in </w:t>
-      </w:r>
-      <w:r>
-        <w:rPr>
-          <w:rFonts w:ascii="Courier New" w:hAnsi="Courier New"/>
-          <w:sz w:val="22"/>
-        </w:rPr>
-        <w:t>difficulty_fusion.py</w:t>
-      </w:r>
-      <w:r>
-        <w:t>, its correctness guaranteed by an external verification script (§9.2).</w:t>
-      </w:r>
-      <w:r>
         <w:rPr>
           <w:b/>
         </w:rPr>
-        <w:t>It must be emphasised:</w:t>
-      </w:r>
-      <w:r>
-        <w:t xml:space="preserve"> while presenting the methodological contributions, this paper also honestly reports the causal-side negative result (no detected internal optimum, significant Junyi negative control), the preregistration gaps of H2 partially tested and H3/H7 unexecuted, and the cross-system boundary that </w:t>
-      </w:r>
-      <w:r>
-        <w:rPr>
-          <w:rFonts w:ascii="Courier New" w:hAnsi="Courier New"/>
-          <w:sz w:val="22"/>
-        </w:rPr>
-        <w:t>srw7</w:t>
-      </w:r>
-      <w:r>
-        <w:t xml:space="preserve"> / direction correction is verified only on Junyi; these </w:t>
+        <w:t>Third, neither λ-shrinkage nor fusion optimisation is cross-system reproduced.</w:t>
+      </w:r>
+      <w:r>
+        <w:t xml:space="preserve"> λ-shrinkage is verified only on Junyi (which has downgrade-rate, repeat-session-rate signals), with no gain on DBE; the O11/O12 optimisation of §7.8 (sign correction + split-half-reliability weighting) is likewise </w:t>
       </w:r>
       <w:r>
         <w:rPr>
           <w:b/>
         </w:rPr>
-        <w:t>honest negative results and boundaries themselves are this paper's methodological contribution to the "preregister–executable–testable" norm, and do not negate the engineering conclusions.</w:t>
+        <w:t>verified only on Junyi</w:t>
+      </w:r>
+      <w:r>
+        <w:t>, not cross-system reproduced. It must be re-verified before writing it into other systems.</w:t>
       </w:r>
     </w:p>
     <w:p>
@@ -29115,10 +28857,10 @@
         <w:rPr>
           <w:b/>
         </w:rPr>
-        <w:t>Educational stake.</w:t>
-      </w:r>
-      <w:r>
-        <w:t xml:space="preserve"> The purity of difficulty-signal fusion matters not merely as measurement tidiness, because an adaptive system's next-item selection is directly driven by the difficulty metric: if multiple difficulty sources are mis-weighted, the next-item difficulty routed to the learner will systematically shift, and this shift accumulates question by question along the adaptive sequence, misaligning the learning path near the "challenge point" and amplifying subsequent item-selection error.This paper's quantile-logit invariance contribution has a concrete educational payoff—it guarantees that the routing precondition "effective weight = nominal weight" is not broken under monotone reparameterisation, thereby suppressing the magnitude of the above cumulative shift.</w:t>
+        <w:t>Fourth, the suspect status of expert annotation itself.</w:t>
+      </w:r>
+      <w:r>
+        <w:t xml:space="preserve"> This paper uses expert labels as an acceptable criterion, but §7.1 measured their correlation with real-performance difficulty at only 0.4326. This means all comparisons anchored on expert labels (including O2, O4, O5, O6) inherit this limitation. We do not believe a better alternative criterion exists, but we also do not treat expert labels as "truth."</w:t>
       </w:r>
     </w:p>
     <w:p>
@@ -29127,13 +28869,286 @@
         <w:jc w:val="both"/>
       </w:pPr>
       <w:r>
-        <w:t>To be clear: this is a mechanistic inference from a measurement property to a routing mechanism; this paper did not test its corresponding learning outcome on real learners, and claims no causal effect.</w:t>
+        <w:rPr>
+          <w:b/>
+        </w:rPr>
+        <w:t>Fifth, data-licence constraints.</w:t>
+      </w:r>
+      <w:r>
+        <w:t xml:space="preserve"> Junyi is CC-BY-NC-SA-4.0, </w:t>
+      </w:r>
+      <w:r>
+        <w:rPr>
+          <w:b/>
+        </w:rPr>
+        <w:t>commercial use prohibited</w:t>
+      </w:r>
+      <w:r>
+        <w:t>; all our analyses are offline, non-commercial, read-only research use. Before submission, the citation obligations of all four datasets must be verified item by item (assist09's Feng et al. 2009 and data page, DBE-KT22's arXiv:2208.12651 and ADA DOI, XES3G5M's NeurIPS 2023 and MIT licence, Junyi's Chang et al. 2015 and CC licence).</w:t>
       </w:r>
     </w:p>
     <w:p>
       <w:pPr>
+        <w:ind w:firstLine="360"/>
+        <w:jc w:val="both"/>
+      </w:pPr>
+      <w:r>
+        <w:rPr>
+          <w:b/>
+        </w:rPr>
+        <w:t>Sixth, the studied system's real deployment data is missing.</w:t>
+      </w:r>
+      <w:r>
+        <w:t xml:space="preserve"> Although the studied system is built and publicly archived, it has no logs produced by real users, so all our measurements rest on the four public datasets; the studied system's role in this paper is a concrete instance of "a class of implementations being criticised" and the carrier of code landing, not an empirical object.</w:t>
+      </w:r>
+    </w:p>
+    <w:p>
+      <w:pPr>
+        <w:ind w:firstLine="360"/>
+        <w:jc w:val="both"/>
+      </w:pPr>
+      <w:r>
+        <w:rPr>
+          <w:b/>
+        </w:rPr>
+        <w:t>Seventh, the learning-addiction-inclination measurement is unvalidated (mandatory disclosure).</w:t>
+      </w:r>
+      <w:r>
+        <w:t xml:space="preserve"> The Learning Addiction Index (LAI) built into the studied system is self-constructed by this project, with five-dimensional weights time 30% / motivation 25% / control 25% / cognitive 10% / function 10%, of which "control + function" totalling 35% is supplied by the self-report measurement layer (instrument catalogue </w:t>
+      </w:r>
+      <w:r>
+        <w:rPr>
+          <w:rFonts w:ascii="Courier New" w:hAnsi="Courier New"/>
+          <w:sz w:val="22"/>
+        </w:rPr>
+        <w:t>instrument_catalog.py</w:t>
+      </w:r>
+      <w:r>
+        <w:t xml:space="preserve">'s SRL-STOP / SLEEP-IMPACT / SOCIAL-IMPACT / TIME-BIAS); dimensions not measured are not counted into the weighting and output </w:t>
+      </w:r>
+      <w:r>
+        <w:rPr>
+          <w:rFonts w:ascii="Courier New" w:hAnsi="Courier New"/>
+          <w:sz w:val="22"/>
+        </w:rPr>
+        <w:t>coverage</w:t>
+      </w:r>
+      <w:r>
+        <w:t xml:space="preserve"> for disclosure, never silently scoring "healthy." </w:t>
+      </w:r>
+      <w:r>
+        <w:rPr>
+          <w:b/>
+        </w:rPr>
+        <w:t>It must be emphasised</w:t>
+      </w:r>
+      <w:r>
+        <w:t xml:space="preserve"> that this scale's items are self-authored by this project, not yet validated for reliability and validity, with no norm and no clinical cutoff, a work-in-progress instrument.</w:t>
+      </w:r>
+    </w:p>
+    <w:p>
+      <w:pPr>
+        <w:ind w:firstLine="360"/>
+        <w:jc w:val="both"/>
+      </w:pPr>
+      <w:r>
+        <w:rPr>
+          <w:b/>
+        </w:rPr>
+        <w:t>This paper did NOT use LAI for any analysis</w:t>
+      </w:r>
+      <w:r>
+        <w:t xml:space="preserve">—all our data come from the four public datasets and contain no self-report scale data; this disclosure only explains the tool's status to prevent readers from assuming the system already has a validated problematic-use measurement capability.The mitigation path is three-pronged and </w:t>
+      </w:r>
+      <w:r>
+        <w:rPr>
+          <w:b/>
+        </w:rPr>
+        <w:t>none completed</w:t>
+      </w:r>
+      <w:r>
+        <w:t>: ① use public validated scales as convergent-validity anchors (BStAS 5 items, Atroszko et al., 2025; SI-10, Loscalzo et al., 2024; Chinese Adolescent Learning Burnout Scale, Wu et al., 2010); ② complete a minimal reliability/validity set (α/ω + EFA→CFA + 2-week retest ICC + correlation with burnout/anxiety); ③ convergent validity between self-report scores and behavioural logs.</w:t>
+      </w:r>
+    </w:p>
+    <w:p>
+      <w:pPr>
+        <w:ind w:firstLine="360"/>
+        <w:jc w:val="both"/>
+      </w:pPr>
+      <w:r>
+        <w:rPr>
+          <w:b/>
+        </w:rPr>
+        <w:t>Eighth (honest negative results as a methodological contribution).</w:t>
+      </w:r>
+      <w:r>
+        <w:t xml:space="preserve"> Reporting "unmet expectations / unexecuted" honestly rather than dressing them up as successes is itself a demonstration of the "preregister–executable–testable" research paradigm, with independent methodological value.</w:t>
+      </w:r>
+    </w:p>
+    <w:p>
+      <w:pPr>
+        <w:ind w:firstLine="360"/>
+        <w:jc w:val="both"/>
+      </w:pPr>
+      <w:r>
+        <w:t xml:space="preserve">Specifically: (a) the causal side executed under a frozen identification strategy yielded a </w:t>
+      </w:r>
+      <w:r>
+        <w:rPr>
+          <w:b/>
+        </w:rPr>
+        <w:t>negative result</w:t>
+      </w:r>
+      <w:r>
+        <w:t xml:space="preserve">—no detected internal optimum in the preregistered sense, and a significant Junyi time-inverted negative control, all dose–response readings downgraded to associational evidence (§8.3), which instead strengthens the separation of "difficulty can be well-definedly fused" from "causal identification of the optimal error rate is not yet supported"; (b) of the seven preregistered hypotheses, </w:t>
+      </w:r>
+      <w:r>
+        <w:rPr>
+          <w:b/>
+        </w:rPr>
+        <w:t>H2 is only partially tested, H3 and H7 unexecuted</w:t>
+      </w:r>
+      <w:r>
+        <w:t xml:space="preserve"> (§8.4), and we do not recast them as supportive conclusions; (c) the </w:t>
+      </w:r>
+      <w:r>
+        <w:rPr>
+          <w:rFonts w:ascii="Courier New" w:hAnsi="Courier New"/>
+          <w:sz w:val="22"/>
+        </w:rPr>
+        <w:t>srw7</w:t>
+      </w:r>
+      <w:r>
+        <w:t xml:space="preserve"> fusion optimisation and direction correction (O8/O11/O12) are </w:t>
+      </w:r>
+      <w:r>
+        <w:rPr>
+          <w:b/>
+        </w:rPr>
+        <w:t>verified only on Junyi, not cross-system reproduced</w:t>
+      </w:r>
+      <w:r>
+        <w:t xml:space="preserve"> (§7.7, 7.8, and 9.3).</w:t>
+      </w:r>
+    </w:p>
+    <w:p>
+      <w:pPr>
+        <w:ind w:firstLine="360"/>
+        <w:jc w:val="both"/>
+      </w:pPr>
+      <w:r>
+        <w:t>These boundaries do not negate this paper's engineering-methodological contributions: the quantile-logit metric's invariant and the criterion dependence of the fusion gain are reproduced on more than two systems; while the above negative results, preregistration gaps, and single-system verification jointly demarcate the method's applicability boundary, which readers should use to calibrate expectations of extrapolation.Accordingly, this paper submits "honest negative results" as one of its contributions, consistent with the reception orientation of the target journals (IEEE TLT / IJAIED / JEDM) toward methodological and reproducibility research.</w:t>
+      </w:r>
+    </w:p>
+    <w:p>
+      <w:pPr>
+        <w:ind w:firstLine="360"/>
+        <w:jc w:val="both"/>
+      </w:pPr>
+      <w:r>
+        <w:rPr>
+          <w:b/>
+        </w:rPr>
+        <w:t>Ninth (scope of the methodological contribution: cross-system gain pending).</w:t>
+      </w:r>
+      <w:r>
+        <w:t xml:space="preserve"> The engineering-methodological contribution must be clearly separated from "cross-system gain." §7 already shows: on DBE-KT22 the fusion gain is only marginally significant (one-sided p = 0.059) and negative after criterion switch, and Junyi is the only system so far that reproduces and verifies the fusion gain; </w:t>
+      </w:r>
+      <w:r>
+        <w:rPr>
+          <w:rFonts w:ascii="Courier New" w:hAnsi="Courier New"/>
+          <w:sz w:val="22"/>
+        </w:rPr>
+        <w:t>srw7</w:t>
+      </w:r>
+      <w:r>
+        <w:t xml:space="preserve"> (sign correction + split-half-reliability weighting) and the §7.3 direction-error correction are </w:t>
+      </w:r>
+      <w:r>
+        <w:rPr>
+          <w:b/>
+        </w:rPr>
+        <w:t>verified methods</w:t>
+      </w:r>
+      <w:r>
+        <w:t xml:space="preserve">, but their </w:t>
+      </w:r>
+      <w:r>
+        <w:rPr>
+          <w:b/>
+        </w:rPr>
+        <w:t>cross-system gain remains to be proven (cross-system gain pending)</w:t>
+      </w:r>
+      <w:r>
+        <w:t xml:space="preserve">. Therefore this paper's contribution positioning is "method + single-system (Junyi) verification + honest boundary on cross-system extrapolation," not an already-proven cross-system improvement; readers must re-verify on their own system's data before writing </w:t>
+      </w:r>
+      <w:r>
+        <w:rPr>
+          <w:rFonts w:ascii="Courier New" w:hAnsi="Courier New"/>
+          <w:sz w:val="22"/>
+        </w:rPr>
+        <w:t>srw7</w:t>
+      </w:r>
+      <w:r>
+        <w:t xml:space="preserve"> into other systems.</w:t>
+      </w:r>
+    </w:p>
+    <w:p>
+      <w:pPr>
+        <w:pStyle w:val="Heading3"/>
+      </w:pPr>
+      <w:r>
+        <w:rPr>
+          <w:rFonts w:ascii="Times New Roman" w:hAnsi="Times New Roman"/>
+          <w:b/>
+          <w:color w:val="000000"/>
+          <w:sz w:val="24"/>
+        </w:rPr>
+        <w:t>9.4 One practical recommendation</w:t>
+      </w:r>
+    </w:p>
+    <w:p>
+      <w:pPr>
+        <w:ind w:firstLine="360"/>
+        <w:jc w:val="both"/>
+      </w:pPr>
+      <w:r>
+        <w:t xml:space="preserve">Synthesising §5.3, §7.3, §7.7, and §7.8, this paper's practical recommendation for the difficulty-fusion module is one sentence: </w:t>
+      </w:r>
+      <w:r>
+        <w:rPr>
+          <w:b/>
+        </w:rPr>
+        <w:t>first switch the metric to quantile logit (unconditional), then decide whether to enable multi-signal fusion by sample size (conditional), and before enabling, do direction correction per signal rather than simple deletion (mandatory).</w:t>
+      </w:r>
+      <w:r>
+        <w:t xml:space="preserve"> The first item's gain is largest and depends on no tuning; the second item's gain approaches zero when observations per item ≥100; the third is a </w:t>
+      </w:r>
+      <w:r>
+        <w:rPr>
+          <w:b/>
+        </w:rPr>
+        <w:t>directional-configuration error</w:t>
+      </w:r>
+      <w:r>
+        <w:t xml:space="preserve">—§7.8 shows that deleting a directionally wrong signal column-wise (O8's fused6) discards its effective information, while correcting its direction (counting it as negative evidence) is instead superior, i.e., </w:t>
+      </w:r>
+      <w:r>
+        <w:rPr>
+          <w:b/>
+        </w:rPr>
+        <w:t>correction beats deletion</w:t>
+      </w:r>
+      <w:r>
+        <w:t>.</w:t>
+      </w:r>
+    </w:p>
+    <w:p>
+      <w:bookmarkStart w:id="9" w:name="section-10"/>
+      <w:pPr>
         <w:pStyle w:val="Heading2"/>
       </w:pPr>
+      <w:bookmarkEnd w:id="9"/>
       <w:r>
         <w:rPr>
           <w:rFonts w:ascii="Times New Roman" w:hAnsi="Times New Roman"/>
@@ -29141,7 +29156,7 @@
           <w:color w:val="000000"/>
           <w:sz w:val="28"/>
         </w:rPr>
-        <w:t>References</w:t>
+        <w:t>10 Honest Gap Inventory</w:t>
       </w:r>
     </w:p>
     <w:p>
@@ -29155,16 +29170,13 @@
         <w:jc w:val="both"/>
       </w:pPr>
       <w:r>
-        <w:t xml:space="preserve">[1] Wilson, R. C., Shenhav, A., Straccia, M., &amp; Cohen, J. D. (2019). The Eighty Five Percent Rule for optimal learning. </w:t>
-      </w:r>
-      <w:r>
-        <w:rPr>
-          <w:i/>
-        </w:rPr>
-        <w:t>Nature Communications</w:t>
-      </w:r>
-      <w:r>
-        <w:t>, 10(1), 4646. DOI: 10.1038/s41467-019-12552-4.</w:t>
+        <w:rPr>
+          <w:b/>
+        </w:rPr>
+        <w:t>Causal side executed, result negative (2026-09-24):</w:t>
+      </w:r>
+      <w:r>
+        <w:t xml:space="preserve"> the preregistered AIPW/DR, dose–response estimation, and negative control were executed under a frozen identification strategy (§8.3); result is no detected internal optimum, significant Junyi negative control (downgraded to associational evidence). Still unexecuted: E-value, the formal ordering test of the five premises, the P-pos-2 simulation-arm control.</w:t>
       </w:r>
     </w:p>
     <w:p>
@@ -29178,26 +29190,13 @@
         <w:jc w:val="both"/>
       </w:pPr>
       <w:r>
-        <w:t xml:space="preserve">[2] Baillifard, A., Belardi, A., &amp; Martarelli, C. S. (2025). Engagement beyond success rate: Evidence from an adaptive learning system. In </w:t>
-      </w:r>
-      <w:r>
-        <w:rPr>
-          <w:i/>
-        </w:rPr>
-        <w:t>The Envisioning Report for Empowering Universities</w:t>
-      </w:r>
-      <w:r>
-        <w:t xml:space="preserve">, nr. 9 (9th edition, 2025), 56–59. European Association of Distance Teaching Universities (EADTU), Parkweg 27, 6212 XN Maastricht, the Netherlands. DOI: 10.5281/zenodo.15908735. (Non-peer-reviewed annual report, not a journal paper; source grade must be noted at the citation in the text.) n = 413; optimal success rate ≈ 80.7%. Bibliographic limits: this DOI is a report-level DOI, not a chapter-level DOI (the chapter has no independent DOI); no ISBN (Zenodo official API metadata </w:t>
-      </w:r>
-      <w:r>
-        <w:rPr>
-          <w:rFonts w:ascii="Courier New" w:hAnsi="Courier New"/>
-          <w:sz w:val="22"/>
-        </w:rPr>
-        <w:t>isbn</w:t>
-      </w:r>
-      <w:r>
-        <w:t xml:space="preserve"> field empty, PDF copyright page also none)—must not be filled; no volume / issue (annual report only has nr. 9)—must not be fabricated. Page numbers per PDF footer print page 56–59; the report TOC marks 57, which has a systematic off-by-one error from page 43 onward. (Verified 2026-09-23.)</w:t>
+        <w:rPr>
+          <w:b/>
+        </w:rPr>
+        <w:t>H2 / H3 not executed per original caliber:</w:t>
+      </w:r>
+      <w:r>
+        <w:t xml:space="preserve"> ECE, Brier, reliability diagram, and 85% target-hit rate not computed; four-source calibration-error ordering not tested (§8.4).</w:t>
       </w:r>
     </w:p>
     <w:p>
@@ -29211,16 +29210,23 @@
         <w:jc w:val="both"/>
       </w:pPr>
       <w:r>
-        <w:t xml:space="preserve">[3] Guadagnoli, M. A., &amp; Lee, T. D. (2004). Challenge point: A framework for conceptualizing the effects of various practice conditions in motor learning. </w:t>
-      </w:r>
-      <w:r>
-        <w:rPr>
-          <w:i/>
-        </w:rPr>
-        <w:t>Journal of Motor Behavior</w:t>
-      </w:r>
-      <w:r>
-        <w:t>, 36(2), 212–224. DOI: 10.3200/JMBR.36.2.212-224.</w:t>
+        <w:rPr>
+          <w:b/>
+        </w:rPr>
+        <w:t>The record-level-holdout validity gap was handled by O10's student-level holdout</w:t>
+      </w:r>
+      <w:r>
+        <w:t xml:space="preserve"> (§7.6): conclusion fully reproduces, the "record-level rather than student-level" concern is tested to have little effect. Remaining boundary: gain decays to ≤0.34 pp for k ≥ 100 (student-level </w:t>
+      </w:r>
+      <w:r>
+        <w:rPr>
+          <w:rFonts w:ascii="Courier New" w:hAnsi="Courier New"/>
+          <w:sz w:val="22"/>
+        </w:rPr>
+        <w:t>srw7</w:t>
+      </w:r>
+      <w:r>
+        <w:t xml:space="preserve"> caliber: k = 100 is +0.335 pp, k = 200 is +0.102 pp; record-level +0.391 / +0.138 pp) and λ-shrinkage not reproduced on DBE (§7.7).</w:t>
       </w:r>
     </w:p>
     <w:p>
@@ -29234,34 +29240,13 @@
         <w:jc w:val="both"/>
       </w:pPr>
       <w:r>
-        <w:t xml:space="preserve">[4] Hodges, N. J., &amp; Lohse, K. R. (2022). An extended challenge-based framework for practice design in sports coaching. </w:t>
-      </w:r>
-      <w:r>
-        <w:rPr>
-          <w:i/>
-        </w:rPr>
-        <w:t>Journal of Sports Sciences</w:t>
-      </w:r>
-      <w:r>
-        <w:t xml:space="preserve">, 40(7), 754–768. DOI: 10.1080/02640414.2021.2015917. (Correction 2026-09-23: originally mis-entered as </w:t>
-      </w:r>
-      <w:r>
-        <w:rPr>
-          <w:i/>
-        </w:rPr>
-        <w:t>International Review of Sport and Exercise Psychology</w:t>
-      </w:r>
-      <w:r>
-        <w:t xml:space="preserve">; verified via publisher page to be </w:t>
-      </w:r>
-      <w:r>
-        <w:rPr>
-          <w:i/>
-        </w:rPr>
-        <w:t>Journal of Sports Sciences</w:t>
-      </w:r>
-      <w:r>
-        <w:t>.)</w:t>
+        <w:rPr>
+          <w:b/>
+        </w:rPr>
+        <w:t>λ-shrinkage not reproduced on DBE</w:t>
+      </w:r>
+      <w:r>
+        <w:t xml:space="preserve"> (§7.5).</w:t>
       </w:r>
     </w:p>
     <w:p>
@@ -29275,16 +29260,42 @@
         <w:jc w:val="both"/>
       </w:pPr>
       <w:r>
-        <w:t xml:space="preserve">[5] Weber, D., Becker, N., Spinath, F. M., &amp; Koch, M. (2025). The stability of IRT parameters under several test equating conditions. </w:t>
-      </w:r>
-      <w:r>
-        <w:rPr>
-          <w:i/>
-        </w:rPr>
-        <w:t>Frontiers in Psychology</w:t>
-      </w:r>
-      <w:r>
-        <w:t>, 16, 1652341. DOI: 10.3389/fpsyg.2025.1652341.</w:t>
+        <w:rPr>
+          <w:b/>
+        </w:rPr>
+        <w:t>O11/O12 optimisation not cross-system reproduced:</w:t>
+      </w:r>
+      <w:r>
+        <w:t xml:space="preserve"> the recommended estimator </w:t>
+      </w:r>
+      <w:r>
+        <w:rPr>
+          <w:rFonts w:ascii="Courier New" w:hAnsi="Courier New"/>
+          <w:sz w:val="22"/>
+        </w:rPr>
+        <w:t>estimate_optimized_difficulty</w:t>
+      </w:r>
+      <w:r>
+        <w:t xml:space="preserve"> (sign correction + split-half-reliability weighting + λ-shrinkage) has been </w:t>
+      </w:r>
+      <w:r>
+        <w:rPr>
+          <w:b/>
+        </w:rPr>
+        <w:t>incrementally landed</w:t>
+      </w:r>
+      <w:r>
+        <w:t xml:space="preserve"> to the repo code (this landing does not change the test count, currently 936 full), its correctness guaranteed by the external verification script </w:t>
+      </w:r>
+      <w:r>
+        <w:rPr>
+          <w:rFonts w:ascii="Courier New" w:hAnsi="Courier New"/>
+          <w:sz w:val="22"/>
+        </w:rPr>
+        <w:t>results/code/o11_land_verify.py</w:t>
+      </w:r>
+      <w:r>
+        <w:t xml:space="preserve"> (15/15 PASS) (§9.2); but this optimisation is verified only on Junyi, not cross-system reproduced (§9.3).</w:t>
       </w:r>
     </w:p>
     <w:p>
@@ -29298,16 +29309,13 @@
         <w:jc w:val="both"/>
       </w:pPr>
       <w:r>
-        <w:t xml:space="preserve">[6] Deng, J. (2025). Linking errors introduced by rapid guessing responses when employing multigroup concurrent IRT scaling. </w:t>
-      </w:r>
-      <w:r>
-        <w:rPr>
-          <w:i/>
-        </w:rPr>
-        <w:t>Large-scale Assessments in Education</w:t>
-      </w:r>
-      <w:r>
-        <w:t>, 13, 28. DOI: 10.1186/s40536-025-00265-8.</w:t>
+        <w:rPr>
+          <w:b/>
+        </w:rPr>
+        <w:t>Expert-label-criterion reliability not independently estimated:</w:t>
+      </w:r>
+      <w:r>
+        <w:t xml:space="preserve"> this paper obtained no inter-rater reliability of the expert annotation; all uncertainty of the 0.4326 distance is attributed to the single realisation of the expert labels.</w:t>
       </w:r>
     </w:p>
     <w:p>
@@ -29321,16 +29329,13 @@
         <w:jc w:val="both"/>
       </w:pPr>
       <w:r>
-        <w:t xml:space="preserve">[7] Liu, Z., Guo, T., Liang, Q., Hou, M., Zhan, B., Tang, J., Luo, W., &amp; Weng, J. (2025). Deep learning based knowledge tracing: A review, a tool and empirical studies. </w:t>
-      </w:r>
-      <w:r>
-        <w:rPr>
-          <w:i/>
-        </w:rPr>
-        <w:t>IEEE Transactions on Knowledge and Data Engineering</w:t>
-      </w:r>
-      <w:r>
-        <w:t>, 37(8), 4512–4536. DOI: 10.1109/TKDE.2025.3552759.</w:t>
+        <w:rPr>
+          <w:b/>
+        </w:rPr>
+        <w:t>assist09 sliding-window analysis uses the "one row per student-problem" revised version;</w:t>
+      </w:r>
+      <w:r>
+        <w:t xml:space="preserve"> help-recording semantics (tutor semantics) handled per the official caliber, possibly differing from some secondary literature.</w:t>
       </w:r>
     </w:p>
     <w:p>
@@ -29344,16 +29349,13 @@
         <w:jc w:val="both"/>
       </w:pPr>
       <w:r>
-        <w:t xml:space="preserve">[8] Ding, M., Agrawal, A., Choo, J., Deng, C., et al. (2024). Easy2Hard-Bench: Standardized difficulty labels for profiling LLM performance and generalization. </w:t>
-      </w:r>
-      <w:r>
-        <w:rPr>
-          <w:i/>
-        </w:rPr>
-        <w:t>Advances in Neural Information Processing Systems (NeurIPS), Datasets and Benchmarks Track</w:t>
-      </w:r>
-      <w:r>
-        <w:t>. arXiv:2409.18433.</w:t>
+        <w:rPr>
+          <w:b/>
+        </w:rPr>
+        <w:t>The synthetic experiment's most-favourable environment:</w:t>
+      </w:r>
+      <w:r>
+        <w:t xml:space="preserve"> the four sources sharing one latent variable is the most favourable setting for the proposition to hold (§4.6).</w:t>
       </w:r>
     </w:p>
     <w:p>
@@ -29367,16 +29369,13 @@
         <w:jc w:val="both"/>
       </w:pPr>
       <w:r>
-        <w:t xml:space="preserve">[9] Dudík, M., Langford, J., &amp; Li, L. (2011). Doubly robust policy evaluation and learning. </w:t>
-      </w:r>
-      <w:r>
-        <w:rPr>
-          <w:i/>
-        </w:rPr>
-        <w:t>Proceedings of the 28th International Conference on Machine Learning (ICML)</w:t>
-      </w:r>
-      <w:r>
-        <w:t>.</w:t>
+        <w:rPr>
+          <w:b/>
+        </w:rPr>
+        <w:t>Data licences not legally verified item by item:</w:t>
+      </w:r>
+      <w:r>
+        <w:t xml:space="preserve"> the citation obligations and commercial restrictions of the four datasets follow official pages and must be closed before submission.</w:t>
       </w:r>
     </w:p>
     <w:p>
@@ -29390,16 +29389,258 @@
         <w:jc w:val="both"/>
       </w:pPr>
       <w:r>
-        <w:t xml:space="preserve">[10] Chernozhukov, V., Chetverikov, D., Demirer, M., Duflo, E., Hansen, C., Newey, W., &amp; Robins, J. (2018). Double/debiased machine learning for treatment and structural parameters. </w:t>
-      </w:r>
-      <w:r>
-        <w:rPr>
-          <w:i/>
-        </w:rPr>
-        <w:t>The Econometrics Journal</w:t>
-      </w:r>
-      <w:r>
-        <w:t>, 21(1), C1–C68. DOI: 10.1111/ectj.12097.</w:t>
+        <w:rPr>
+          <w:b/>
+        </w:rPr>
+        <w:t>LAI unvalidated and not used in this paper</w:t>
+      </w:r>
+      <w:r>
+        <w:t xml:space="preserve"> (§9.3 seventh point); all three mitigation paths unfinished.</w:t>
+      </w:r>
+    </w:p>
+    <w:p>
+      <w:bookmarkStart w:id="10" w:name="section-11"/>
+      <w:pPr>
+        <w:pStyle w:val="Heading2"/>
+      </w:pPr>
+      <w:bookmarkEnd w:id="10"/>
+      <w:r>
+        <w:rPr>
+          <w:rFonts w:ascii="Times New Roman" w:hAnsi="Times New Roman"/>
+          <w:b/>
+          <w:color w:val="000000"/>
+          <w:sz w:val="28"/>
+        </w:rPr>
+        <w:t>11 Conclusions</w:t>
+      </w:r>
+    </w:p>
+    <w:p>
+      <w:pPr>
+        <w:ind w:firstLine="360"/>
+        <w:jc w:val="both"/>
+      </w:pPr>
+      <w:r>
+        <w:t>This paper rewrote the question "can difficulty be measured on one common scale," which engineering practice had skipped, into a falsifiable measurement proposition, and gave results on synthetic data and four public learning-log corpora.</w:t>
+      </w:r>
+      <w:r>
+        <w:rPr>
+          <w:b/>
+        </w:rPr>
+        <w:t>The caliber must be stated first:</w:t>
+      </w:r>
+      <w:r>
+        <w:t xml:space="preserve"> the </w:t>
+      </w:r>
+      <w:r>
+        <w:rPr>
+          <w:b/>
+        </w:rPr>
+        <w:t>real-data test of proposition C1 was completed at only one real system, assist09</w:t>
+      </w:r>
+      <w:r>
+        <w:t xml:space="preserve"> (994 items); the Junyi, DBE-KT22, and XES3G5M datasets bear the multi-signal-fusion consistency experiment, the expert-annotation experiment, and the knowledge-tree / ordered-transition experiment, and </w:t>
+      </w:r>
+      <w:r>
+        <w:rPr>
+          <w:b/>
+        </w:rPr>
+        <w:t>do not constitute a test of C1</w:t>
+      </w:r>
+      <w:r>
+        <w:t xml:space="preserve"> (see the title-caliber note at the front).The instability proposition holds: linear [0,1] fusion's effective weights equal neither the nominal weights (π₁ = 0.532 vs.</w:t>
+      </w:r>
+    </w:p>
+    <w:p>
+      <w:pPr>
+        <w:ind w:firstLine="360"/>
+        <w:jc w:val="both"/>
+      </w:pPr>
+      <w:r>
+        <w:t>w₁ = 0.40) nor themselves under monotone reparameterisation (nonlinear monotone L1 = 0.1276, 36.4% cell rank reversal, strongest counterexample complete sign reversal), while the quantile-logit metric is strictly invariant to it (0 under shared calibration, 0.016 sampling noise under independent calibration); on assist09's 994 items, the real drift falls from 0.5357 to 0.0001.</w:t>
+      </w:r>
+    </w:p>
+    <w:p>
+      <w:pPr>
+        <w:ind w:firstLine="360"/>
+        <w:jc w:val="both"/>
+      </w:pPr>
+      <w:r>
+        <w:t>Multi-signal fusion does raise consistency with expert difficulty labels (DBE 0.2207 → 0.2899, repeated-cross-validation optimised weights 0.5240 ± 0.1069; Junyi 0.2610 → 0.3629, repeated cross-validation 0.4023 ± 0.0480), driven by a "self-reported difficulty high and trust low" differential feature; but the rank correlation between expert labels and real-performance difficulty is only 0.4326, and after switching the criterion to holdout performance, fusion is worse than success rate alone at every sample size on both datasets, with win rate 0.00—these gains are consistency gains, not predictive-power improvement.We further located a directional error in the fusion configuration and proposed sample-size-adaptive shrinkage, whose gain reaches +3.43 percentage points at k = 10 (O8 caliber) and decays below 0.22 percentage points for k ≥ 100, and is not reproduced on DBE.</w:t>
+      </w:r>
+    </w:p>
+    <w:p>
+      <w:pPr>
+        <w:ind w:firstLine="360"/>
+        <w:jc w:val="both"/>
+      </w:pPr>
+      <w:r>
+        <w:t xml:space="preserve">Further optimisation of the fusion estimator itself (sign correction + split-half-reliability weighting, </w:t>
+      </w:r>
+      <w:r>
+        <w:rPr>
+          <w:rFonts w:ascii="Courier New" w:hAnsi="Courier New"/>
+          <w:sz w:val="22"/>
+        </w:rPr>
+        <w:t>srw7</w:t>
+      </w:r>
+      <w:r>
+        <w:t>) was doubly validated at record-level and student-level holdout: non-inferior to success-rate-only at every sample size, and consistently better than fused6 which only deletes.</w:t>
+      </w:r>
+    </w:p>
+    <w:p>
+      <w:pPr>
+        <w:ind w:firstLine="360"/>
+        <w:jc w:val="both"/>
+      </w:pPr>
+      <w:r>
+        <w:t xml:space="preserve">Finally, this paper reports that the single-value mode of the assist09 sliding-window error-rate distribution is </w:t>
+      </w:r>
+      <w:r>
+        <w:rPr>
+          <w:b/>
+        </w:rPr>
+        <w:t>error rate 0.25 (success rate 75%)</w:t>
+      </w:r>
+      <w:r>
+        <w:t xml:space="preserve"> (n = 286,150 windows; 21 discrete support points; the 80–85% success band occupies only 19.64%), and explicitly states that this descriptive evidence </w:t>
+      </w:r>
+      <w:r>
+        <w:rPr>
+          <w:b/>
+        </w:rPr>
+        <w:t>is a distribution of experienced difficulty and is not a test of the 85% rule or of the 80.7% value, and the earlier-reported "mode interval 0.15–0.20" was verified to be a binning-boundary artifact of equal-width binning and is voided</w:t>
+      </w:r>
+      <w:r>
+        <w:t xml:space="preserve">; </w:t>
+      </w:r>
+      <w:r>
+        <w:rPr>
+          <w:b/>
+        </w:rPr>
+        <w:t>the preregistered dose–response identification was fully executed on 2026-09-24 under a frozen identification strategy (LF-CIS-2026-09-22), yielding "no internal optimum in the preregistered sense detected," and Junyi's time-inverted negative control is significant</w:t>
+      </w:r>
+      <w:r>
+        <w:t xml:space="preserve"> (low-end exceedance 1.000/0.998), so per that strategy's §6.2 handling convention all d</w:t>
+      </w:r>
+    </w:p>
+    <w:p>
+      <w:pPr>
+        <w:ind w:firstLine="360"/>
+        <w:jc w:val="both"/>
+      </w:pPr>
+      <w:r>
+        <w:t xml:space="preserve">ose–response conclusions are downgraded to associational evidence; therefore this paper </w:t>
+      </w:r>
+      <w:r>
+        <w:rPr>
+          <w:b/>
+        </w:rPr>
+        <w:t>still makes no point estimate, confidence interval, or test against 15.87% for the optimal error rate</w:t>
+      </w:r>
+      <w:r>
+        <w:t xml:space="preserve"> (that test presupposes the existence of an internal optimum, a premise not supported), and makes no directional assertion about whether that value holds for real learners (full execution record in §8.3; the conclusion section's earlier wording "causal side not executed" was legacy from an old version and was corrected on 2026-09-25).</w:t>
+      </w:r>
+    </w:p>
+    <w:p>
+      <w:pPr>
+        <w:ind w:firstLine="360"/>
+        <w:jc w:val="both"/>
+      </w:pPr>
+      <w:r>
+        <w:t xml:space="preserve">The three conclusions have partially landed in the studied system's difficulty-metric layer (full test 936 passed); the </w:t>
+      </w:r>
+      <w:r>
+        <w:rPr>
+          <w:rFonts w:ascii="Courier New" w:hAnsi="Courier New"/>
+          <w:sz w:val="22"/>
+        </w:rPr>
+        <w:t>srw7</w:t>
+      </w:r>
+      <w:r>
+        <w:t xml:space="preserve"> estimator has also landed as the incremental function </w:t>
+      </w:r>
+      <w:r>
+        <w:rPr>
+          <w:rFonts w:ascii="Courier New" w:hAnsi="Courier New"/>
+          <w:sz w:val="22"/>
+        </w:rPr>
+        <w:t>estimate_optimized_difficulty()</w:t>
+      </w:r>
+      <w:r>
+        <w:t xml:space="preserve"> in </w:t>
+      </w:r>
+      <w:r>
+        <w:rPr>
+          <w:rFonts w:ascii="Courier New" w:hAnsi="Courier New"/>
+          <w:sz w:val="22"/>
+        </w:rPr>
+        <w:t>difficulty_fusion.py</w:t>
+      </w:r>
+      <w:r>
+        <w:t>, its correctness guaranteed by an external verification script (§9.2).</w:t>
+      </w:r>
+      <w:r>
+        <w:rPr>
+          <w:b/>
+        </w:rPr>
+        <w:t>It must be emphasised:</w:t>
+      </w:r>
+      <w:r>
+        <w:t xml:space="preserve"> while presenting the methodological contributions, this paper also honestly reports the causal-side negative result (no detected internal optimum, significant Junyi negative control), the preregistration gaps of H2 partially tested and H3/H7 unexecuted, and the cross-system boundary that </w:t>
+      </w:r>
+      <w:r>
+        <w:rPr>
+          <w:rFonts w:ascii="Courier New" w:hAnsi="Courier New"/>
+          <w:sz w:val="22"/>
+        </w:rPr>
+        <w:t>srw7</w:t>
+      </w:r>
+      <w:r>
+        <w:t xml:space="preserve"> / direction correction is verified only on Junyi; these </w:t>
+      </w:r>
+      <w:r>
+        <w:rPr>
+          <w:b/>
+        </w:rPr>
+        <w:t>honest negative results and boundaries themselves are this paper's methodological contribution to the "preregister–executable–testable" norm, and do not negate the engineering conclusions.</w:t>
+      </w:r>
+    </w:p>
+    <w:p>
+      <w:pPr>
+        <w:ind w:firstLine="360"/>
+        <w:jc w:val="both"/>
+      </w:pPr>
+      <w:r>
+        <w:rPr>
+          <w:b/>
+        </w:rPr>
+        <w:t>Educational stake.</w:t>
+      </w:r>
+      <w:r>
+        <w:t xml:space="preserve"> The purity of difficulty-signal fusion matters not merely as measurement tidiness, because an adaptive system's next-item selection is directly driven by the difficulty metric: if multiple difficulty sources are mis-weighted, the next-item difficulty routed to the learner will systematically shift, and this shift accumulates question by question along the adaptive sequence, misaligning the learning path near the "challenge point" and amplifying subsequent item-selection error.This paper's quantile-logit invariance contribution has a concrete educational payoff—it guarantees that the routing precondition "effective weight = nominal weight" is not broken under monotone reparameterisation, thereby suppressing the magnitude of the above cumulative shift.</w:t>
+      </w:r>
+    </w:p>
+    <w:p>
+      <w:pPr>
+        <w:ind w:firstLine="360"/>
+        <w:jc w:val="both"/>
+      </w:pPr>
+      <w:r>
+        <w:t>To be clear: this is a mechanistic inference from a measurement property to a routing mechanism; this paper did not test its corresponding learning outcome on real learners, and claims no causal effect.</w:t>
+      </w:r>
+    </w:p>
+    <w:p>
+      <w:pPr>
+        <w:pStyle w:val="Heading2"/>
+      </w:pPr>
+      <w:r>
+        <w:rPr>
+          <w:rFonts w:ascii="Times New Roman" w:hAnsi="Times New Roman"/>
+          <w:b/>
+          <w:color w:val="000000"/>
+          <w:sz w:val="28"/>
+        </w:rPr>
+        <w:t>References</w:t>
       </w:r>
     </w:p>
     <w:p>
@@ -29407,22 +29648,22 @@
         <w:pStyle w:val="ListNumber"/>
         <w:numPr>
           <w:ilvl w:val="0"/>
-          <w:numId w:val="14"/>
+          <w:numId w:val="15"/>
         </w:numPr>
         <w:spacing w:after="120"/>
         <w:jc w:val="both"/>
       </w:pPr>
       <w:r>
-        <w:t xml:space="preserve">[11] VanderWeele, T. J., &amp; Ding, P. (2017). Sensitivity analysis in observational research: Introducing the E-value. </w:t>
+        <w:t xml:space="preserve">[1] Wilson, R. C., Shenhav, A., Straccia, M., &amp; Cohen, J. D. (2019). The Eighty Five Percent Rule for optimal learning. </w:t>
       </w:r>
       <w:r>
         <w:rPr>
           <w:i/>
         </w:rPr>
-        <w:t>Annals of Internal Medicine</w:t>
-      </w:r>
-      <w:r>
-        <w:t>, 167(4), 268–274. DOI: 10.7326/M16-2607.</w:t>
+        <w:t>Nature Communications</w:t>
+      </w:r>
+      <w:r>
+        <w:t>, 10(1), 4646. DOI: 10.1038/s41467-019-12552-4.</w:t>
       </w:r>
     </w:p>
     <w:p>
@@ -29430,22 +29671,32 @@
         <w:pStyle w:val="ListNumber"/>
         <w:numPr>
           <w:ilvl w:val="0"/>
-          <w:numId w:val="14"/>
+          <w:numId w:val="15"/>
         </w:numPr>
         <w:spacing w:after="120"/>
         <w:jc w:val="both"/>
       </w:pPr>
       <w:r>
-        <w:t xml:space="preserve">[12] Feng, M., Heffernan, N. T., &amp; Koedinger, K. R. (2009). Addressing the assessment challenge with an online system that tutors as it assesses. </w:t>
+        <w:t xml:space="preserve">[2] Baillifard, A., Belardi, A., &amp; Martarelli, C. S. (2025). Engagement beyond success rate: Evidence from an adaptive learning system. In </w:t>
       </w:r>
       <w:r>
         <w:rPr>
           <w:i/>
         </w:rPr>
-        <w:t>User Modeling and User-Adapted Interaction</w:t>
-      </w:r>
-      <w:r>
-        <w:t>, 19(3), 243–266. DOI: 10.1007/s11257-009-9063-7. ASSISTments 2009–2010 skill-builder data page URL: https://sites.google.com/site/assistmentsdata/home/2009-2010-assistment-data/skill-builder-data-2009-2010 (HTTP 200 verified). Warning: the widely circulated old URL variant is now 404, disabled. Note: the data page self-citation titles the paper "...in an Intelligent Tutoring System that tutors as it assesses," inconsistent with the published title—use the published title.</w:t>
+        <w:t>The Envisioning Report for Empowering Universities</w:t>
+      </w:r>
+      <w:r>
+        <w:t xml:space="preserve">, nr. 9 (9th edition, 2025), 56–59. European Association of Distance Teaching Universities (EADTU), Parkweg 27, 6212 XN Maastricht, the Netherlands. DOI: 10.5281/zenodo.15908735. (Non-peer-reviewed annual report, not a journal paper; source grade must be noted at the citation in the text.) n = 413; optimal success rate ≈ 80.7%. Bibliographic limits: this DOI is a report-level DOI, not a chapter-level DOI (the chapter has no independent DOI); no ISBN (Zenodo official API metadata </w:t>
+      </w:r>
+      <w:r>
+        <w:rPr>
+          <w:rFonts w:ascii="Courier New" w:hAnsi="Courier New"/>
+          <w:sz w:val="22"/>
+        </w:rPr>
+        <w:t>isbn</w:t>
+      </w:r>
+      <w:r>
+        <w:t xml:space="preserve"> field empty, PDF copyright page also none)—must not be filled; no volume / issue (annual report only has nr. 9)—must not be fabricated. Page numbers per PDF footer print page 56–59; the report TOC marks 57, which has a systematic off-by-one error from page 43 onward. (Verified 2026-09-23.)</w:t>
       </w:r>
     </w:p>
     <w:p>
@@ -29453,13 +29704,22 @@
         <w:pStyle w:val="ListNumber"/>
         <w:numPr>
           <w:ilvl w:val="0"/>
-          <w:numId w:val="14"/>
+          <w:numId w:val="15"/>
         </w:numPr>
         <w:spacing w:after="120"/>
         <w:jc w:val="both"/>
       </w:pPr>
       <w:r>
-        <w:t>[13] Abdelrahman, G., Wang, Q., et al. (2022). Knowledge tracing for complex skill training data. arXiv:2208.12651. (DBE-KT22; ADA Dataverse DOI: 10.26193/6DZWOH)</w:t>
+        <w:t xml:space="preserve">[3] Guadagnoli, M. A., &amp; Lee, T. D. (2004). Challenge point: A framework for conceptualizing the effects of various practice conditions in motor learning. </w:t>
+      </w:r>
+      <w:r>
+        <w:rPr>
+          <w:i/>
+        </w:rPr>
+        <w:t>Journal of Motor Behavior</w:t>
+      </w:r>
+      <w:r>
+        <w:t>, 36(2), 212–224. DOI: 10.3200/JMBR.36.2.212-224.</w:t>
       </w:r>
     </w:p>
     <w:p>
@@ -29467,22 +29727,40 @@
         <w:pStyle w:val="ListNumber"/>
         <w:numPr>
           <w:ilvl w:val="0"/>
-          <w:numId w:val="14"/>
+          <w:numId w:val="15"/>
         </w:numPr>
         <w:spacing w:after="120"/>
         <w:jc w:val="both"/>
       </w:pPr>
       <w:r>
-        <w:t xml:space="preserve">[14] Liu, Z., Liu, Q., Guo, T., Chen, J., Huang, S., Zhao, X., Tang, J., Luo, W., &amp; Weng, J. (2023). XES3G5M: A knowledge tracing benchmark dataset with auxiliary information. In </w:t>
+        <w:t xml:space="preserve">[4] Hodges, N. J., &amp; Lohse, K. R. (2022). An extended challenge-based framework for practice design in sports coaching. </w:t>
       </w:r>
       <w:r>
         <w:rPr>
           <w:i/>
         </w:rPr>
-        <w:t>Advances in Neural Information Processing Systems 36 (NeurIPS 2023), Datasets and Benchmarks Track</w:t>
-      </w:r>
-      <w:r>
-        <w:t>, 32958–32970. DOI: 10.52202/075280-1429. (MIT licence.) Bibliographic limits: pages 32958–32970 from OpenAlex; NeurIPS official page shows no pages; if the target journal does not require conference pages, DOI alone suffices. arXiv number left blank—the paper has no arXiv preprint (arXiv API returns 0); must not fabricate. Disambiguation: Liu, Z., Chen, J., &amp; Luo, W. (2023) "Recent Advances on Deep Learning based Knowledge Tracing" (WSDM 2023, 1295–1296) is a same-first-author, same-field, same-year two-page short paper, not this entry—do not miscite.</w:t>
+        <w:t>Journal of Sports Sciences</w:t>
+      </w:r>
+      <w:r>
+        <w:t xml:space="preserve">, 40(7), 754–768. DOI: 10.1080/02640414.2021.2015917. (Correction 2026-09-23: originally mis-entered as </w:t>
+      </w:r>
+      <w:r>
+        <w:rPr>
+          <w:i/>
+        </w:rPr>
+        <w:t>International Review of Sport and Exercise Psychology</w:t>
+      </w:r>
+      <w:r>
+        <w:t xml:space="preserve">; verified via publisher page to be </w:t>
+      </w:r>
+      <w:r>
+        <w:rPr>
+          <w:i/>
+        </w:rPr>
+        <w:t>Journal of Sports Sciences</w:t>
+      </w:r>
+      <w:r>
+        <w:t>.)</w:t>
       </w:r>
     </w:p>
     <w:p>
@@ -29490,31 +29768,22 @@
         <w:pStyle w:val="ListNumber"/>
         <w:numPr>
           <w:ilvl w:val="0"/>
-          <w:numId w:val="14"/>
+          <w:numId w:val="15"/>
         </w:numPr>
         <w:spacing w:after="120"/>
         <w:jc w:val="both"/>
       </w:pPr>
       <w:r>
-        <w:t xml:space="preserve">[15] Chang, H.-S., Hsu, H.-J., &amp; Chen, K.-T. (2015). Modeling exercise relationships in e-learning: A unified approach. In </w:t>
+        <w:t xml:space="preserve">[5] Weber, D., Becker, N., Spinath, F. M., &amp; Koch, M. (2025). The stability of IRT parameters under several test equating conditions. </w:t>
       </w:r>
       <w:r>
         <w:rPr>
           <w:i/>
         </w:rPr>
-        <w:t>Proceedings of the 8th International Conference on Educational Data Mining (EDM 2015)</w:t>
-      </w:r>
-      <w:r>
-        <w:t xml:space="preserve">, 532–535. International Educational Data Mining Society. ISBN: 978-8-4606-9425-0. URL: https://www.educationaldatamining.org/EDM2015/proceedings/short532-535.pdf (HTTP 200 verified). Junyi Academy dataset, CC-BY-NC-SA-4.0, commercial use prohibited. (Correction 2026-09-23: entire original entry was wrong, replaced. Originally entered as </w:t>
-      </w:r>
-      <w:r>
-        <w:rPr>
-          <w:i/>
-        </w:rPr>
-        <w:t>Educational Technology &amp; Society</w:t>
-      </w:r>
-      <w:r>
-        <w:t>, 18(2), 128–141. Counter-evidence: ET&amp;S official Volume 18, Number 2 (2015) TOC PDF contains no such paper; the "128–141" spans three unrelated papers. No DOI found (EDM 2015 proceedings assigned no Crossref DOI), left blank, must not fabricate, use the URL above. This paper remains the source of the Junyi Academy dataset.)</w:t>
+        <w:t>Frontiers in Psychology</w:t>
+      </w:r>
+      <w:r>
+        <w:t>, 16, 1652341. DOI: 10.3389/fpsyg.2025.1652341.</w:t>
       </w:r>
     </w:p>
     <w:p>
@@ -29522,22 +29791,22 @@
         <w:pStyle w:val="ListNumber"/>
         <w:numPr>
           <w:ilvl w:val="0"/>
-          <w:numId w:val="14"/>
+          <w:numId w:val="15"/>
         </w:numPr>
         <w:spacing w:after="120"/>
         <w:jc w:val="both"/>
       </w:pPr>
       <w:r>
-        <w:t xml:space="preserve">[16] Kolen, M. J., &amp; Brennan, R. L. (2014). </w:t>
+        <w:t xml:space="preserve">[6] Deng, J. (2025). Linking errors introduced by rapid guessing responses when employing multigroup concurrent IRT scaling. </w:t>
       </w:r>
       <w:r>
         <w:rPr>
           <w:i/>
         </w:rPr>
-        <w:t>Test Equating, Scaling, and Linking: Methods and Practices</w:t>
-      </w:r>
-      <w:r>
-        <w:t xml:space="preserve"> (3rd ed.). Springer.</w:t>
+        <w:t>Large-scale Assessments in Education</w:t>
+      </w:r>
+      <w:r>
+        <w:t>, 13, 28. DOI: 10.1186/s40536-025-00265-8.</w:t>
       </w:r>
     </w:p>
     <w:p>
@@ -29545,22 +29814,22 @@
         <w:pStyle w:val="ListNumber"/>
         <w:numPr>
           <w:ilvl w:val="0"/>
-          <w:numId w:val="14"/>
+          <w:numId w:val="15"/>
         </w:numPr>
         <w:spacing w:after="120"/>
         <w:jc w:val="both"/>
       </w:pPr>
       <w:r>
-        <w:t xml:space="preserve">[17] Platt, J. (1999). Probabilistic outputs for support vector machines and comparisons to regularized likelihood methods. In </w:t>
+        <w:t xml:space="preserve">[7] Liu, Z., Guo, T., Liang, Q., Hou, M., Zhan, B., Tang, J., Luo, W., &amp; Weng, J. (2025). Deep learning based knowledge tracing: A review, a tool and empirical studies. </w:t>
       </w:r>
       <w:r>
         <w:rPr>
           <w:i/>
         </w:rPr>
-        <w:t>Advances in Large Margin Classifiers</w:t>
-      </w:r>
-      <w:r>
-        <w:t>. MIT Press.</w:t>
+        <w:t>IEEE Transactions on Knowledge and Data Engineering</w:t>
+      </w:r>
+      <w:r>
+        <w:t>, 37(8), 4512–4536. DOI: 10.1109/TKDE.2025.3552759.</w:t>
       </w:r>
     </w:p>
     <w:p>
@@ -29568,22 +29837,22 @@
         <w:pStyle w:val="ListNumber"/>
         <w:numPr>
           <w:ilvl w:val="0"/>
-          <w:numId w:val="14"/>
+          <w:numId w:val="15"/>
         </w:numPr>
         <w:spacing w:after="120"/>
         <w:jc w:val="both"/>
       </w:pPr>
       <w:r>
-        <w:t xml:space="preserve">[18] Guo, C., Pleiss, G., Sun, Y., &amp; Weinberger, K. Q. (2017). On calibration of modern neural networks. </w:t>
+        <w:t xml:space="preserve">[8] Ding, M., Agrawal, A., Choo, J., Deng, C., et al. (2024). Easy2Hard-Bench: Standardized difficulty labels for profiling LLM performance and generalization. </w:t>
       </w:r>
       <w:r>
         <w:rPr>
           <w:i/>
         </w:rPr>
-        <w:t>Proceedings of the 34th International Conference on Machine Learning (ICML)</w:t>
-      </w:r>
-      <w:r>
-        <w:t>.</w:t>
+        <w:t>Advances in Neural Information Processing Systems (NeurIPS), Datasets and Benchmarks Track</w:t>
+      </w:r>
+      <w:r>
+        <w:t>. arXiv:2409.18433.</w:t>
       </w:r>
     </w:p>
     <w:p>
@@ -29591,22 +29860,22 @@
         <w:pStyle w:val="ListNumber"/>
         <w:numPr>
           <w:ilvl w:val="0"/>
-          <w:numId w:val="14"/>
+          <w:numId w:val="15"/>
         </w:numPr>
         <w:spacing w:after="120"/>
         <w:jc w:val="both"/>
       </w:pPr>
       <w:r>
-        <w:t xml:space="preserve">[19] Efron, B., &amp; Tibshirani, R. J. (1993). </w:t>
+        <w:t xml:space="preserve">[9] Dudík, M., Langford, J., &amp; Li, L. (2011). Doubly robust policy evaluation and learning. </w:t>
       </w:r>
       <w:r>
         <w:rPr>
           <w:i/>
         </w:rPr>
-        <w:t>An Introduction to the Bootstrap</w:t>
-      </w:r>
-      <w:r>
-        <w:t>. Chapman &amp; Hall.</w:t>
+        <w:t>Proceedings of the 28th International Conference on Machine Learning (ICML)</w:t>
+      </w:r>
+      <w:r>
+        <w:t>.</w:t>
       </w:r>
     </w:p>
     <w:p>
@@ -29614,22 +29883,22 @@
         <w:pStyle w:val="ListNumber"/>
         <w:numPr>
           <w:ilvl w:val="0"/>
-          <w:numId w:val="14"/>
+          <w:numId w:val="15"/>
         </w:numPr>
         <w:spacing w:after="120"/>
         <w:jc w:val="both"/>
       </w:pPr>
       <w:r>
-        <w:t xml:space="preserve">[20] Cohen, J. (1968). Weighted kappa: Nominal scale agreement with provision for scaled disagreement or partial credit. </w:t>
+        <w:t xml:space="preserve">[10] Chernozhukov, V., Chetverikov, D., Demirer, M., Duflo, E., Hansen, C., Newey, W., &amp; Robins, J. (2018). Double/debiased machine learning for treatment and structural parameters. </w:t>
       </w:r>
       <w:r>
         <w:rPr>
           <w:i/>
         </w:rPr>
-        <w:t>Psychological Bulletin</w:t>
-      </w:r>
-      <w:r>
-        <w:t>, 70(4), 213–220.</w:t>
+        <w:t>The Econometrics Journal</w:t>
+      </w:r>
+      <w:r>
+        <w:t>, 21(1), C1–C68. DOI: 10.1111/ectj.12097.</w:t>
       </w:r>
     </w:p>
     <w:p>
@@ -29637,22 +29906,22 @@
         <w:pStyle w:val="ListNumber"/>
         <w:numPr>
           <w:ilvl w:val="0"/>
-          <w:numId w:val="14"/>
+          <w:numId w:val="15"/>
         </w:numPr>
         <w:spacing w:after="120"/>
         <w:jc w:val="both"/>
       </w:pPr>
       <w:r>
-        <w:t xml:space="preserve">[21] Benjamini, Y., &amp; Hochberg, Y. (1995). Controlling the false discovery rate: A practical and powerful approach to multiple testing. </w:t>
+        <w:t xml:space="preserve">[11] VanderWeele, T. J., &amp; Ding, P. (2017). Sensitivity analysis in observational research: Introducing the E-value. </w:t>
       </w:r>
       <w:r>
         <w:rPr>
           <w:i/>
         </w:rPr>
-        <w:t>Journal of the Royal Statistical Society: Series B</w:t>
-      </w:r>
-      <w:r>
-        <w:t>, 57(1), 289–300.</w:t>
+        <w:t>Annals of Internal Medicine</w:t>
+      </w:r>
+      <w:r>
+        <w:t>, 167(4), 268–274. DOI: 10.7326/M16-2607.</w:t>
       </w:r>
     </w:p>
     <w:p>
@@ -29660,22 +29929,22 @@
         <w:pStyle w:val="ListNumber"/>
         <w:numPr>
           <w:ilvl w:val="0"/>
-          <w:numId w:val="14"/>
+          <w:numId w:val="15"/>
         </w:numPr>
         <w:spacing w:after="120"/>
         <w:jc w:val="both"/>
       </w:pPr>
       <w:r>
-        <w:t xml:space="preserve">[22] Atroszko, P. A., Charzyńska, E., Buźniak, A., Czerwiński, S. K., Griffiths, M. D., et al. (2025). Validity, reliability, and cross-cultural comparability of a problematic overstudying scale. </w:t>
+        <w:t xml:space="preserve">[12] Feng, M., Heffernan, N. T., &amp; Koedinger, K. R. (2009). Addressing the assessment challenge with an online system that tutors as it assesses. </w:t>
       </w:r>
       <w:r>
         <w:rPr>
           <w:i/>
         </w:rPr>
-        <w:t>International Journal of Mental Health and Addiction</w:t>
-      </w:r>
-      <w:r>
-        <w:t>. DOI: 10.1007/s11469-023-01128-5.</w:t>
+        <w:t>User Modeling and User-Adapted Interaction</w:t>
+      </w:r>
+      <w:r>
+        <w:t>, 19(3), 243–266. DOI: 10.1007/s11257-009-9063-7. ASSISTments 2009–2010 skill-builder data page URL: https://sites.google.com/site/assistmentsdata/home/2009-2010-assistment-data/skill-builder-data-2009-2010 (HTTP 200 verified). Warning: the widely circulated old URL variant is now 404, disabled. Note: the data page self-citation titles the paper "...in an Intelligent Tutoring System that tutors as it assesses," inconsistent with the published title—use the published title.</w:t>
       </w:r>
     </w:p>
     <w:p>
@@ -29683,22 +29952,13 @@
         <w:pStyle w:val="ListNumber"/>
         <w:numPr>
           <w:ilvl w:val="0"/>
-          <w:numId w:val="14"/>
+          <w:numId w:val="15"/>
         </w:numPr>
         <w:spacing w:after="120"/>
         <w:jc w:val="both"/>
       </w:pPr>
       <w:r>
-        <w:t xml:space="preserve">[23] Loscalzo, Y., Wetstone, H., Schuldberg, D., Giannini, M., &amp; Rice, K. G. (2024). Studyholism in the United States and Italy. </w:t>
-      </w:r>
-      <w:r>
-        <w:rPr>
-          <w:i/>
-        </w:rPr>
-        <w:t>Current Psychology</w:t>
-      </w:r>
-      <w:r>
-        <w:t>, 43(29), 24608–24621. DOI: 10.1007/s12144-024-06163-6.</w:t>
+        <w:t>[13] Abdelrahman, G., Wang, Q., et al. (2022). Knowledge tracing for complex skill training data. arXiv:2208.12651. (DBE-KT22; ADA Dataverse DOI: 10.26193/6DZWOH)</w:t>
       </w:r>
     </w:p>
     <w:p>
@@ -29706,22 +29966,22 @@
         <w:pStyle w:val="ListNumber"/>
         <w:numPr>
           <w:ilvl w:val="0"/>
-          <w:numId w:val="14"/>
+          <w:numId w:val="15"/>
         </w:numPr>
         <w:spacing w:after="120"/>
         <w:jc w:val="both"/>
       </w:pPr>
       <w:r>
-        <w:t xml:space="preserve">[24] Wu, Y., Dai, X., Wen, Z., &amp; Cui, H. (2010). Compilation of an adolescent learning burnout scale. </w:t>
+        <w:t xml:space="preserve">[14] Liu, Z., Liu, Q., Guo, T., Chen, J., Huang, S., Zhao, X., Tang, J., Luo, W., &amp; Weng, J. (2023). XES3G5M: A knowledge tracing benchmark dataset with auxiliary information. In </w:t>
       </w:r>
       <w:r>
         <w:rPr>
           <w:i/>
         </w:rPr>
-        <w:t>Chinese Journal of Clinical Psychology</w:t>
-      </w:r>
-      <w:r>
-        <w:t>, 18(2), 152–154.</w:t>
+        <w:t>Advances in Neural Information Processing Systems 36 (NeurIPS 2023), Datasets and Benchmarks Track</w:t>
+      </w:r>
+      <w:r>
+        <w:t>, 32958–32970. DOI: 10.52202/075280-1429. (MIT licence.) Bibliographic limits: pages 32958–32970 from OpenAlex; NeurIPS official page shows no pages; if the target journal does not require conference pages, DOI alone suffices. arXiv number left blank—the paper has no arXiv preprint (arXiv API returns 0); must not fabricate. Disambiguation: Liu, Z., Chen, J., &amp; Luo, W. (2023) "Recent Advances on Deep Learning based Knowledge Tracing" (WSDM 2023, 1295–1296) is a same-first-author, same-field, same-year two-page short paper, not this entry—do not miscite.</w:t>
       </w:r>
     </w:p>
     <w:p>
@@ -29729,22 +29989,31 @@
         <w:pStyle w:val="ListNumber"/>
         <w:numPr>
           <w:ilvl w:val="0"/>
-          <w:numId w:val="14"/>
+          <w:numId w:val="15"/>
         </w:numPr>
         <w:spacing w:after="120"/>
         <w:jc w:val="both"/>
       </w:pPr>
       <w:r>
-        <w:t xml:space="preserve">[25] Al-Fawakhiri, N., Kayani, S., &amp; McDougle, S. D. (2023). Evidence of an optimal error rate for motor skill learning. </w:t>
+        <w:t xml:space="preserve">[15] Chang, H.-S., Hsu, H.-J., &amp; Chen, K.-T. (2015). Modeling exercise relationships in e-learning: A unified approach. In </w:t>
       </w:r>
       <w:r>
         <w:rPr>
           <w:i/>
         </w:rPr>
-        <w:t>bioRxiv</w:t>
-      </w:r>
-      <w:r>
-        <w:t>. DOI: 10.1101/2023.07.19.549705. (Supplemented 2026-09-27: previously a dangling reference; now added. Evidence grade must be stated with citation: as of this verification still a bioRxiv preprint (latest v5, not peer-reviewed), v3 revision note self-states "rearranged methods section for submission," no formal publication record found, so it must not be described as published. Content consistent with text: N=192, empirical optimal error rate ≈ 30%, domain motor-skill learning. Placement limit unchanged: value not extrapolable to academic learning, cited only as a task-dependence case, not in the RQ2 decision table, not as a new target value.)</w:t>
+        <w:t>Proceedings of the 8th International Conference on Educational Data Mining (EDM 2015)</w:t>
+      </w:r>
+      <w:r>
+        <w:t xml:space="preserve">, 532–535. International Educational Data Mining Society. ISBN: 978-8-4606-9425-0. URL: https://www.educationaldatamining.org/EDM2015/proceedings/short532-535.pdf (HTTP 200 verified). Junyi Academy dataset, CC-BY-NC-SA-4.0, commercial use prohibited. (Correction 2026-09-23: entire original entry was wrong, replaced. Originally entered as </w:t>
+      </w:r>
+      <w:r>
+        <w:rPr>
+          <w:i/>
+        </w:rPr>
+        <w:t>Educational Technology &amp; Society</w:t>
+      </w:r>
+      <w:r>
+        <w:t>, 18(2), 128–141. Counter-evidence: ET&amp;S official Volume 18, Number 2 (2015) TOC PDF contains no such paper; the "128–141" spans three unrelated papers. No DOI found (EDM 2015 proceedings assigned no Crossref DOI), left blank, must not fabricate, use the URL above. This paper remains the source of the Junyi Academy dataset.)</w:t>
       </w:r>
     </w:p>
     <w:p>
@@ -29752,7 +30021,237 @@
         <w:pStyle w:val="ListNumber"/>
         <w:numPr>
           <w:ilvl w:val="0"/>
-          <w:numId w:val="14"/>
+          <w:numId w:val="15"/>
+        </w:numPr>
+        <w:spacing w:after="120"/>
+        <w:jc w:val="both"/>
+      </w:pPr>
+      <w:r>
+        <w:t xml:space="preserve">[16] Kolen, M. J., &amp; Brennan, R. L. (2014). </w:t>
+      </w:r>
+      <w:r>
+        <w:rPr>
+          <w:i/>
+        </w:rPr>
+        <w:t>Test Equating, Scaling, and Linking: Methods and Practices</w:t>
+      </w:r>
+      <w:r>
+        <w:t xml:space="preserve"> (3rd ed.). Springer.</w:t>
+      </w:r>
+    </w:p>
+    <w:p>
+      <w:pPr>
+        <w:pStyle w:val="ListNumber"/>
+        <w:numPr>
+          <w:ilvl w:val="0"/>
+          <w:numId w:val="15"/>
+        </w:numPr>
+        <w:spacing w:after="120"/>
+        <w:jc w:val="both"/>
+      </w:pPr>
+      <w:r>
+        <w:t xml:space="preserve">[17] Platt, J. (1999). Probabilistic outputs for support vector machines and comparisons to regularized likelihood methods. In </w:t>
+      </w:r>
+      <w:r>
+        <w:rPr>
+          <w:i/>
+        </w:rPr>
+        <w:t>Advances in Large Margin Classifiers</w:t>
+      </w:r>
+      <w:r>
+        <w:t>. MIT Press.</w:t>
+      </w:r>
+    </w:p>
+    <w:p>
+      <w:pPr>
+        <w:pStyle w:val="ListNumber"/>
+        <w:numPr>
+          <w:ilvl w:val="0"/>
+          <w:numId w:val="15"/>
+        </w:numPr>
+        <w:spacing w:after="120"/>
+        <w:jc w:val="both"/>
+      </w:pPr>
+      <w:r>
+        <w:t xml:space="preserve">[18] Guo, C., Pleiss, G., Sun, Y., &amp; Weinberger, K. Q. (2017). On calibration of modern neural networks. </w:t>
+      </w:r>
+      <w:r>
+        <w:rPr>
+          <w:i/>
+        </w:rPr>
+        <w:t>Proceedings of the 34th International Conference on Machine Learning (ICML)</w:t>
+      </w:r>
+      <w:r>
+        <w:t>.</w:t>
+      </w:r>
+    </w:p>
+    <w:p>
+      <w:pPr>
+        <w:pStyle w:val="ListNumber"/>
+        <w:numPr>
+          <w:ilvl w:val="0"/>
+          <w:numId w:val="15"/>
+        </w:numPr>
+        <w:spacing w:after="120"/>
+        <w:jc w:val="both"/>
+      </w:pPr>
+      <w:r>
+        <w:t xml:space="preserve">[19] Efron, B., &amp; Tibshirani, R. J. (1993). </w:t>
+      </w:r>
+      <w:r>
+        <w:rPr>
+          <w:i/>
+        </w:rPr>
+        <w:t>An Introduction to the Bootstrap</w:t>
+      </w:r>
+      <w:r>
+        <w:t>. Chapman &amp; Hall.</w:t>
+      </w:r>
+    </w:p>
+    <w:p>
+      <w:pPr>
+        <w:pStyle w:val="ListNumber"/>
+        <w:numPr>
+          <w:ilvl w:val="0"/>
+          <w:numId w:val="15"/>
+        </w:numPr>
+        <w:spacing w:after="120"/>
+        <w:jc w:val="both"/>
+      </w:pPr>
+      <w:r>
+        <w:t xml:space="preserve">[20] Cohen, J. (1968). Weighted kappa: Nominal scale agreement with provision for scaled disagreement or partial credit. </w:t>
+      </w:r>
+      <w:r>
+        <w:rPr>
+          <w:i/>
+        </w:rPr>
+        <w:t>Psychological Bulletin</w:t>
+      </w:r>
+      <w:r>
+        <w:t>, 70(4), 213–220.</w:t>
+      </w:r>
+    </w:p>
+    <w:p>
+      <w:pPr>
+        <w:pStyle w:val="ListNumber"/>
+        <w:numPr>
+          <w:ilvl w:val="0"/>
+          <w:numId w:val="15"/>
+        </w:numPr>
+        <w:spacing w:after="120"/>
+        <w:jc w:val="both"/>
+      </w:pPr>
+      <w:r>
+        <w:t xml:space="preserve">[21] Benjamini, Y., &amp; Hochberg, Y. (1995). Controlling the false discovery rate: A practical and powerful approach to multiple testing. </w:t>
+      </w:r>
+      <w:r>
+        <w:rPr>
+          <w:i/>
+        </w:rPr>
+        <w:t>Journal of the Royal Statistical Society: Series B</w:t>
+      </w:r>
+      <w:r>
+        <w:t>, 57(1), 289–300.</w:t>
+      </w:r>
+    </w:p>
+    <w:p>
+      <w:pPr>
+        <w:pStyle w:val="ListNumber"/>
+        <w:numPr>
+          <w:ilvl w:val="0"/>
+          <w:numId w:val="15"/>
+        </w:numPr>
+        <w:spacing w:after="120"/>
+        <w:jc w:val="both"/>
+      </w:pPr>
+      <w:r>
+        <w:t xml:space="preserve">[22] Atroszko, P. A., Charzyńska, E., Buźniak, A., Czerwiński, S. K., Griffiths, M. D., et al. (2025). Validity, reliability, and cross-cultural comparability of a problematic overstudying scale. </w:t>
+      </w:r>
+      <w:r>
+        <w:rPr>
+          <w:i/>
+        </w:rPr>
+        <w:t>International Journal of Mental Health and Addiction</w:t>
+      </w:r>
+      <w:r>
+        <w:t>. DOI: 10.1007/s11469-023-01128-5.</w:t>
+      </w:r>
+    </w:p>
+    <w:p>
+      <w:pPr>
+        <w:pStyle w:val="ListNumber"/>
+        <w:numPr>
+          <w:ilvl w:val="0"/>
+          <w:numId w:val="15"/>
+        </w:numPr>
+        <w:spacing w:after="120"/>
+        <w:jc w:val="both"/>
+      </w:pPr>
+      <w:r>
+        <w:t xml:space="preserve">[23] Loscalzo, Y., Wetstone, H., Schuldberg, D., Giannini, M., &amp; Rice, K. G. (2024). Studyholism in the United States and Italy. </w:t>
+      </w:r>
+      <w:r>
+        <w:rPr>
+          <w:i/>
+        </w:rPr>
+        <w:t>Current Psychology</w:t>
+      </w:r>
+      <w:r>
+        <w:t>, 43(29), 24608–24621. DOI: 10.1007/s12144-024-06163-6.</w:t>
+      </w:r>
+    </w:p>
+    <w:p>
+      <w:pPr>
+        <w:pStyle w:val="ListNumber"/>
+        <w:numPr>
+          <w:ilvl w:val="0"/>
+          <w:numId w:val="15"/>
+        </w:numPr>
+        <w:spacing w:after="120"/>
+        <w:jc w:val="both"/>
+      </w:pPr>
+      <w:r>
+        <w:t xml:space="preserve">[24] Wu, Y., Dai, X., Wen, Z., &amp; Cui, H. (2010). Compilation of an adolescent learning burnout scale. </w:t>
+      </w:r>
+      <w:r>
+        <w:rPr>
+          <w:i/>
+        </w:rPr>
+        <w:t>Chinese Journal of Clinical Psychology</w:t>
+      </w:r>
+      <w:r>
+        <w:t>, 18(2), 152–154.</w:t>
+      </w:r>
+    </w:p>
+    <w:p>
+      <w:pPr>
+        <w:pStyle w:val="ListNumber"/>
+        <w:numPr>
+          <w:ilvl w:val="0"/>
+          <w:numId w:val="15"/>
+        </w:numPr>
+        <w:spacing w:after="120"/>
+        <w:jc w:val="both"/>
+      </w:pPr>
+      <w:r>
+        <w:t xml:space="preserve">[25] Al-Fawakhiri, N., Kayani, S., &amp; McDougle, S. D. (2023). Evidence of an optimal error rate for motor skill learning. </w:t>
+      </w:r>
+      <w:r>
+        <w:rPr>
+          <w:i/>
+        </w:rPr>
+        <w:t>bioRxiv</w:t>
+      </w:r>
+      <w:r>
+        <w:t>. DOI: 10.1101/2023.07.19.549705. (Supplemented 2026-09-27: previously a dangling reference; now added. Evidence grade must be stated with citation: as of this verification still a bioRxiv preprint (latest v5, not peer-reviewed), v3 revision note self-states "rearranged methods section for submission," no formal publication record found, so it must not be described as published. Content consistent with text: N=192, empirical optimal error rate ≈ 30%, domain motor-skill learning. Placement limit unchanged: value not extrapolable to academic learning, cited only as a task-dependence case, not in the RQ2 decision table, not as a new target value.)</w:t>
+      </w:r>
+    </w:p>
+    <w:p>
+      <w:pPr>
+        <w:pStyle w:val="ListNumber"/>
+        <w:numPr>
+          <w:ilvl w:val="0"/>
+          <w:numId w:val="15"/>
         </w:numPr>
         <w:spacing w:after="120"/>
         <w:jc w:val="both"/>
@@ -30034,6 +30533,12 @@
     </w:lvlOverride>
   </w:num>
   <w:num w:numId="14">
+    <w:abstractNumId w:val="7"/>
+    <w:lvlOverride w:ilvl="0">
+      <w:startOverride w:val="1"/>
+    </w:lvlOverride>
+  </w:num>
+  <w:num w:numId="15">
     <w:abstractNumId w:val="7"/>
     <w:lvlOverride w:ilvl="0">
       <w:startOverride w:val="1"/>

</xml_diff>